<commit_message>
Feat: Nang cap toan dien He goi Slide (3 loai), Bien dang TU/CR/SH/FR theo chuoi lien, Gio 2 cap van toc (Vtk & 25m/s), Tai trong nuoc WA/WB, Quy dao cap DUL dong 5-15 diem, va Hinh ve mo/tru theo dung ti le thuc te
</commit_message>
<xml_diff>
--- a/output_reports/Mố A1_Bao_cao.docx
+++ b/output_reports/Mố A1_Bao_cao.docx
@@ -1720,7 +1720,7 @@
                 <w:rFonts w:ascii="Times New Roman" w:hAnsi="Times New Roman"/>
                 <w:sz w:val="17"/>
               </w:rPr>
-              <w:t>11. Móng cọc: Nén Pmax</w:t>
+              <w:t>11. Móng cọc: TTGH Cường độ (ULS)</w:t>
             </w:r>
           </w:p>
         </w:tc>
@@ -1744,7 +1744,7 @@
                 <w:rFonts w:ascii="Times New Roman" w:hAnsi="Times New Roman"/>
                 <w:sz w:val="17"/>
               </w:rPr>
-              <w:t>Pmax = 4575.3 kN</w:t>
+              <w:t>Pmax = 6283.0 kN</w:t>
             </w:r>
           </w:p>
         </w:tc>
@@ -1768,7 +1768,7 @@
                 <w:rFonts w:ascii="Times New Roman" w:hAnsi="Times New Roman"/>
                 <w:sz w:val="17"/>
               </w:rPr>
-              <w:t>Pcp = 4500.0 kN</w:t>
+              <w:t>φRn = 6710.2 kN</w:t>
             </w:r>
           </w:p>
         </w:tc>
@@ -1792,7 +1792,7 @@
                 <w:rFonts w:ascii="Times New Roman" w:hAnsi="Times New Roman"/>
                 <w:sz w:val="17"/>
               </w:rPr>
-              <w:t>1.02</w:t>
+              <w:t>0.94</w:t>
             </w:r>
           </w:p>
         </w:tc>
@@ -1816,7 +1816,7 @@
                 <w:rFonts w:ascii="Times New Roman" w:hAnsi="Times New Roman"/>
                 <w:sz w:val="17"/>
               </w:rPr>
-              <w:t>Điều 10.7.3</w:t>
+              <w:t>Điều 10.7.3.8</w:t>
             </w:r>
           </w:p>
         </w:tc>
@@ -1839,10 +1839,10 @@
               <w:rPr>
                 <w:rFonts w:ascii="Times New Roman" w:hAnsi="Times New Roman"/>
                 <w:b/>
-                <w:color w:val="C80000"/>
-                <w:sz w:val="17"/>
-              </w:rPr>
-              <w:t>KHÔNG ĐẠT</w:t>
+                <w:color w:val="008000"/>
+                <w:sz w:val="17"/>
+              </w:rPr>
+              <w:t>ĐẠT</w:t>
             </w:r>
           </w:p>
         </w:tc>
@@ -1868,7 +1868,7 @@
                 <w:rFonts w:ascii="Times New Roman" w:hAnsi="Times New Roman"/>
                 <w:sz w:val="17"/>
               </w:rPr>
-              <w:t>12. Móng cọc: Kéo Pmin</w:t>
+              <w:t>12. Móng cọc: TTGH Đặc biệt (EXTREME)</w:t>
             </w:r>
           </w:p>
         </w:tc>
@@ -1892,7 +1892,7 @@
                 <w:rFonts w:ascii="Times New Roman" w:hAnsi="Times New Roman"/>
                 <w:sz w:val="17"/>
               </w:rPr>
-              <w:t>Pmin = 1470.6 kN</w:t>
+              <w:t>Pmax = 6919.8 kN</w:t>
             </w:r>
           </w:p>
         </w:tc>
@@ -1916,7 +1916,7 @@
                 <w:rFonts w:ascii="Times New Roman" w:hAnsi="Times New Roman"/>
                 <w:sz w:val="17"/>
               </w:rPr>
-              <w:t>Pmin &gt;= 0 kN</w:t>
+              <w:t>Rn,ext = 10927.1 kN (φ=1.0)</w:t>
             </w:r>
           </w:p>
         </w:tc>
@@ -1940,7 +1940,7 @@
                 <w:rFonts w:ascii="Times New Roman" w:hAnsi="Times New Roman"/>
                 <w:sz w:val="17"/>
               </w:rPr>
-              <w:t>—</w:t>
+              <w:t>0.63</w:t>
             </w:r>
           </w:p>
         </w:tc>
@@ -1964,7 +1964,7 @@
                 <w:rFonts w:ascii="Times New Roman" w:hAnsi="Times New Roman"/>
                 <w:sz w:val="17"/>
               </w:rPr>
-              <w:t>Điều 10.7.3.7</w:t>
+              <w:t>Điều 10.5.5.3.3</w:t>
             </w:r>
           </w:p>
         </w:tc>
@@ -1972,6 +1972,154 @@
           <w:tcPr>
             <w:tcW w:type="dxa" w:w="1152"/>
             <w:shd w:fill="F2F5F9"/>
+            <w:tcMar>
+              <w:top w:w="60" w:type="dxa"/>
+              <w:bottom w:w="60" w:type="dxa"/>
+              <w:left w:w="80" w:type="dxa"/>
+              <w:right w:w="80" w:type="dxa"/>
+            </w:tcMar>
+          </w:tcPr>
+          <w:p>
+            <w:pPr>
+              <w:jc w:val="center"/>
+            </w:pPr>
+            <w:r>
+              <w:rPr>
+                <w:rFonts w:ascii="Times New Roman" w:hAnsi="Times New Roman"/>
+                <w:b/>
+                <w:color w:val="008000"/>
+                <w:sz w:val="17"/>
+              </w:rPr>
+              <w:t>ĐẠT</w:t>
+            </w:r>
+          </w:p>
+        </w:tc>
+      </w:tr>
+      <w:tr>
+        <w:tc>
+          <w:tcPr>
+            <w:tcW w:type="dxa" w:w="2880"/>
+            <w:shd w:fill="FFFFFF"/>
+            <w:tcMar>
+              <w:top w:w="60" w:type="dxa"/>
+              <w:bottom w:w="60" w:type="dxa"/>
+              <w:left w:w="80" w:type="dxa"/>
+              <w:right w:w="80" w:type="dxa"/>
+            </w:tcMar>
+          </w:tcPr>
+          <w:p>
+            <w:pPr>
+              <w:jc w:val="left"/>
+            </w:pPr>
+            <w:r>
+              <w:rPr>
+                <w:rFonts w:ascii="Times New Roman" w:hAnsi="Times New Roman"/>
+                <w:sz w:val="17"/>
+              </w:rPr>
+              <w:t>13. Móng cọc: Kiểm tra chịu nhổ</w:t>
+            </w:r>
+          </w:p>
+        </w:tc>
+        <w:tc>
+          <w:tcPr>
+            <w:tcW w:type="dxa" w:w="1872"/>
+            <w:shd w:fill="FFFFFF"/>
+            <w:tcMar>
+              <w:top w:w="60" w:type="dxa"/>
+              <w:bottom w:w="60" w:type="dxa"/>
+              <w:left w:w="80" w:type="dxa"/>
+              <w:right w:w="80" w:type="dxa"/>
+            </w:tcMar>
+          </w:tcPr>
+          <w:p>
+            <w:pPr>
+              <w:jc w:val="right"/>
+            </w:pPr>
+            <w:r>
+              <w:rPr>
+                <w:rFonts w:ascii="Times New Roman" w:hAnsi="Times New Roman"/>
+                <w:sz w:val="17"/>
+              </w:rPr>
+              <w:t>Pmin = 1470.6 kN</w:t>
+            </w:r>
+          </w:p>
+        </w:tc>
+        <w:tc>
+          <w:tcPr>
+            <w:tcW w:type="dxa" w:w="1872"/>
+            <w:shd w:fill="FFFFFF"/>
+            <w:tcMar>
+              <w:top w:w="60" w:type="dxa"/>
+              <w:bottom w:w="60" w:type="dxa"/>
+              <w:left w:w="80" w:type="dxa"/>
+              <w:right w:w="80" w:type="dxa"/>
+            </w:tcMar>
+          </w:tcPr>
+          <w:p>
+            <w:pPr>
+              <w:jc w:val="right"/>
+            </w:pPr>
+            <w:r>
+              <w:rPr>
+                <w:rFonts w:ascii="Times New Roman" w:hAnsi="Times New Roman"/>
+                <w:sz w:val="17"/>
+              </w:rPr>
+              <w:t>Pmin &gt;= 0 kN (Kháng nhổ: 4887.6 kN)</w:t>
+            </w:r>
+          </w:p>
+        </w:tc>
+        <w:tc>
+          <w:tcPr>
+            <w:tcW w:type="dxa" w:w="1008"/>
+            <w:shd w:fill="FFFFFF"/>
+            <w:tcMar>
+              <w:top w:w="60" w:type="dxa"/>
+              <w:bottom w:w="60" w:type="dxa"/>
+              <w:left w:w="80" w:type="dxa"/>
+              <w:right w:w="80" w:type="dxa"/>
+            </w:tcMar>
+          </w:tcPr>
+          <w:p>
+            <w:pPr>
+              <w:jc w:val="right"/>
+            </w:pPr>
+            <w:r>
+              <w:rPr>
+                <w:rFonts w:ascii="Times New Roman" w:hAnsi="Times New Roman"/>
+                <w:sz w:val="17"/>
+              </w:rPr>
+              <w:t>—</w:t>
+            </w:r>
+          </w:p>
+        </w:tc>
+        <w:tc>
+          <w:tcPr>
+            <w:tcW w:type="dxa" w:w="1440"/>
+            <w:shd w:fill="FFFFFF"/>
+            <w:tcMar>
+              <w:top w:w="60" w:type="dxa"/>
+              <w:bottom w:w="60" w:type="dxa"/>
+              <w:left w:w="80" w:type="dxa"/>
+              <w:right w:w="80" w:type="dxa"/>
+            </w:tcMar>
+          </w:tcPr>
+          <w:p>
+            <w:pPr>
+              <w:jc w:val="right"/>
+            </w:pPr>
+            <w:r>
+              <w:rPr>
+                <w:rFonts w:ascii="Times New Roman" w:hAnsi="Times New Roman"/>
+                <w:sz w:val="17"/>
+              </w:rPr>
+              <w:t>Điều 10.7.3.7</w:t>
+            </w:r>
+          </w:p>
+        </w:tc>
+        <w:tc>
+          <w:tcPr>
+            <w:tcW w:type="dxa" w:w="1152"/>
+            <w:shd w:fill="FFFFFF"/>
             <w:tcMar>
               <w:top w:w="60" w:type="dxa"/>
               <w:bottom w:w="60" w:type="dxa"/>
@@ -2614,7 +2762,7 @@
                 <w:rFonts w:ascii="Times New Roman" w:hAnsi="Times New Roman"/>
                 <w:sz w:val="17"/>
               </w:rPr>
-              <w:t>Góc chéo α = 70°</w:t>
+              <w:t>Góc chéo α = 70.0°</w:t>
             </w:r>
           </w:p>
         </w:tc>
@@ -3928,7 +4076,7 @@
                 <w:rFonts w:ascii="Times New Roman" w:hAnsi="Times New Roman"/>
                 <w:sz w:val="17"/>
               </w:rPr>
-              <w:t>Pcp = 4500.0 kN</w:t>
+              <w:t>Pcp = 4800.0 kN</w:t>
             </w:r>
           </w:p>
         </w:tc>
@@ -12374,7 +12522,1166 @@
         <w:rPr>
           <w:color w:val="1F4E79"/>
         </w:rPr>
-        <w:t>CHƯƠNG 5. PHÂN TÍCH VÀ KIỂM TOÁN PHẢN LỰC MÓNG CỌC (PHƯƠNG PHÁP MA TRẬN ĐỘ CỨNG TS_PILE)</w:t>
+        <w:t>CHƯƠNG 5. ĐỊA CHẤT CÔNG TRÌNH VÀ TÍNH TOÁN SỨC CHỊU TẢI CỌC (TS-CAP TCVN 11823-10)</w:t>
+      </w:r>
+    </w:p>
+    <w:p>
+      <w:r>
+        <w:t>• Đường kính cọc D = 1.2 m | Chiều dài cọc L = 35.00 m</w:t>
+        <w:br/>
+        <w:t>• Cao độ đáy bệ = 0.0 m | Cao độ mũi cọc = -35.0 m | Mực nước ngầm = 2.0 m</w:t>
+        <w:br/>
+        <w:t>• Sức kháng ma sát thân danh định: Qsn = 9883.6 kN</w:t>
+        <w:br/>
+        <w:t>• Sức kháng mũi cọc danh định: Qpn = 2482.5 kN</w:t>
+        <w:br/>
+        <w:t>• Sức kháng danh định tổng cộng: Rn = 12366.1 kN</w:t>
+        <w:br/>
+        <w:t>• TTGH Cường độ (ULS): Sức kháng tính toán φRn = 6710.2 kN (φ = 0.50~0.55)</w:t>
+        <w:br/>
+        <w:t>• TTGH Đặc biệt (EXTREME): Sức kháng tính toán Rn,ext = 10927.1 kN (φ = 1.0)</w:t>
+        <w:br/>
+        <w:t>• TTGH Sử dụng (SLS): φ = 1.0 | Sức kháng nhổ cho phép: 4887.6 kN</w:t>
+        <w:br/>
+      </w:r>
+    </w:p>
+    <w:tbl>
+      <w:tblPr>
+        <w:tblW w:type="auto" w:w="0"/>
+        <w:jc w:val="center"/>
+        <w:tblLayout w:type="fixed"/>
+        <w:tblLook w:firstColumn="1" w:firstRow="1" w:lastColumn="0" w:lastRow="0" w:noHBand="0" w:noVBand="1" w:val="04A0"/>
+      </w:tblPr>
+      <w:tblGrid>
+        <w:gridCol w:w="1096"/>
+        <w:gridCol w:w="1096"/>
+        <w:gridCol w:w="1096"/>
+        <w:gridCol w:w="1096"/>
+        <w:gridCol w:w="1096"/>
+        <w:gridCol w:w="1096"/>
+        <w:gridCol w:w="1096"/>
+        <w:gridCol w:w="1096"/>
+        <w:gridCol w:w="1096"/>
+      </w:tblGrid>
+      <w:tr>
+        <w:tc>
+          <w:tcPr>
+            <w:tcW w:type="dxa" w:w="2880"/>
+            <w:shd w:fill="1F4E79"/>
+            <w:tcMar>
+              <w:top w:w="100" w:type="dxa"/>
+              <w:bottom w:w="100" w:type="dxa"/>
+              <w:left w:w="90" w:type="dxa"/>
+              <w:right w:w="90" w:type="dxa"/>
+            </w:tcMar>
+          </w:tcPr>
+          <w:p>
+            <w:pPr>
+              <w:jc w:val="center"/>
+            </w:pPr>
+            <w:r>
+              <w:rPr>
+                <w:rFonts w:ascii="Times New Roman" w:hAnsi="Times New Roman"/>
+                <w:b/>
+                <w:color w:val="FFFFFF"/>
+                <w:sz w:val="18"/>
+              </w:rPr>
+              <w:t>Lớp đất / Đá</w:t>
+            </w:r>
+          </w:p>
+        </w:tc>
+        <w:tc>
+          <w:tcPr>
+            <w:tcW w:type="dxa" w:w="1296"/>
+            <w:shd w:fill="1F4E79"/>
+            <w:tcMar>
+              <w:top w:w="100" w:type="dxa"/>
+              <w:bottom w:w="100" w:type="dxa"/>
+              <w:left w:w="90" w:type="dxa"/>
+              <w:right w:w="90" w:type="dxa"/>
+            </w:tcMar>
+          </w:tcPr>
+          <w:p>
+            <w:pPr>
+              <w:jc w:val="center"/>
+            </w:pPr>
+            <w:r>
+              <w:rPr>
+                <w:rFonts w:ascii="Times New Roman" w:hAnsi="Times New Roman"/>
+                <w:b/>
+                <w:color w:val="FFFFFF"/>
+                <w:sz w:val="18"/>
+              </w:rPr>
+              <w:t>Cao độ đáy (m)</w:t>
+            </w:r>
+          </w:p>
+        </w:tc>
+        <w:tc>
+          <w:tcPr>
+            <w:tcW w:type="dxa" w:w="1008"/>
+            <w:shd w:fill="1F4E79"/>
+            <w:tcMar>
+              <w:top w:w="100" w:type="dxa"/>
+              <w:bottom w:w="100" w:type="dxa"/>
+              <w:left w:w="90" w:type="dxa"/>
+              <w:right w:w="90" w:type="dxa"/>
+            </w:tcMar>
+          </w:tcPr>
+          <w:p>
+            <w:pPr>
+              <w:jc w:val="center"/>
+            </w:pPr>
+            <w:r>
+              <w:rPr>
+                <w:rFonts w:ascii="Times New Roman" w:hAnsi="Times New Roman"/>
+                <w:b/>
+                <w:color w:val="FFFFFF"/>
+                <w:sz w:val="18"/>
+              </w:rPr>
+              <w:t>Dày (m)</w:t>
+            </w:r>
+          </w:p>
+        </w:tc>
+        <w:tc>
+          <w:tcPr>
+            <w:tcW w:type="dxa" w:w="1296"/>
+            <w:shd w:fill="1F4E79"/>
+            <w:tcMar>
+              <w:top w:w="100" w:type="dxa"/>
+              <w:bottom w:w="100" w:type="dxa"/>
+              <w:left w:w="90" w:type="dxa"/>
+              <w:right w:w="90" w:type="dxa"/>
+            </w:tcMar>
+          </w:tcPr>
+          <w:p>
+            <w:pPr>
+              <w:jc w:val="center"/>
+            </w:pPr>
+            <w:r>
+              <w:rPr>
+                <w:rFonts w:ascii="Times New Roman" w:hAnsi="Times New Roman"/>
+                <w:b/>
+                <w:color w:val="FFFFFF"/>
+                <w:sz w:val="18"/>
+              </w:rPr>
+              <w:t>Loại</w:t>
+            </w:r>
+          </w:p>
+        </w:tc>
+        <w:tc>
+          <w:tcPr>
+            <w:tcW w:type="dxa" w:w="864"/>
+            <w:shd w:fill="1F4E79"/>
+            <w:tcMar>
+              <w:top w:w="100" w:type="dxa"/>
+              <w:bottom w:w="100" w:type="dxa"/>
+              <w:left w:w="90" w:type="dxa"/>
+              <w:right w:w="90" w:type="dxa"/>
+            </w:tcMar>
+          </w:tcPr>
+          <w:p>
+            <w:pPr>
+              <w:jc w:val="center"/>
+            </w:pPr>
+            <w:r>
+              <w:rPr>
+                <w:rFonts w:ascii="Times New Roman" w:hAnsi="Times New Roman"/>
+                <w:b/>
+                <w:color w:val="FFFFFF"/>
+                <w:sz w:val="18"/>
+              </w:rPr>
+              <w:t>SPT</w:t>
+            </w:r>
+          </w:p>
+        </w:tc>
+        <w:tc>
+          <w:tcPr>
+            <w:tcW w:type="dxa" w:w="1008"/>
+            <w:shd w:fill="1F4E79"/>
+            <w:tcMar>
+              <w:top w:w="100" w:type="dxa"/>
+              <w:bottom w:w="100" w:type="dxa"/>
+              <w:left w:w="90" w:type="dxa"/>
+              <w:right w:w="90" w:type="dxa"/>
+            </w:tcMar>
+          </w:tcPr>
+          <w:p>
+            <w:pPr>
+              <w:jc w:val="center"/>
+            </w:pPr>
+            <w:r>
+              <w:rPr>
+                <w:rFonts w:ascii="Times New Roman" w:hAnsi="Times New Roman"/>
+                <w:b/>
+                <w:color w:val="FFFFFF"/>
+                <w:sz w:val="18"/>
+              </w:rPr>
+              <w:t>γ (kN/m³)</w:t>
+            </w:r>
+          </w:p>
+        </w:tc>
+        <w:tc>
+          <w:tcPr>
+            <w:tcW w:type="dxa" w:w="1728"/>
+            <w:shd w:fill="1F4E79"/>
+            <w:tcMar>
+              <w:top w:w="100" w:type="dxa"/>
+              <w:bottom w:w="100" w:type="dxa"/>
+              <w:left w:w="90" w:type="dxa"/>
+              <w:right w:w="90" w:type="dxa"/>
+            </w:tcMar>
+          </w:tcPr>
+          <w:p>
+            <w:pPr>
+              <w:jc w:val="center"/>
+            </w:pPr>
+            <w:r>
+              <w:rPr>
+                <w:rFonts w:ascii="Times New Roman" w:hAnsi="Times New Roman"/>
+                <w:b/>
+                <w:color w:val="FFFFFF"/>
+                <w:sz w:val="18"/>
+              </w:rPr>
+              <w:t>c (MPa) / φ (°)</w:t>
+            </w:r>
+          </w:p>
+        </w:tc>
+        <w:tc>
+          <w:tcPr>
+            <w:tcW w:type="dxa" w:w="1152"/>
+            <w:shd w:fill="1F4E79"/>
+            <w:tcMar>
+              <w:top w:w="100" w:type="dxa"/>
+              <w:bottom w:w="100" w:type="dxa"/>
+              <w:left w:w="90" w:type="dxa"/>
+              <w:right w:w="90" w:type="dxa"/>
+            </w:tcMar>
+          </w:tcPr>
+          <w:p>
+            <w:pPr>
+              <w:jc w:val="center"/>
+            </w:pPr>
+            <w:r>
+              <w:rPr>
+                <w:rFonts w:ascii="Times New Roman" w:hAnsi="Times New Roman"/>
+                <w:b/>
+                <w:color w:val="FFFFFF"/>
+                <w:sz w:val="18"/>
+              </w:rPr>
+              <w:t>Qs (kN)</w:t>
+            </w:r>
+          </w:p>
+        </w:tc>
+        <w:tc>
+          <w:tcPr>
+            <w:tcW w:type="dxa" w:w="1152"/>
+            <w:shd w:fill="1F4E79"/>
+            <w:tcMar>
+              <w:top w:w="100" w:type="dxa"/>
+              <w:bottom w:w="100" w:type="dxa"/>
+              <w:left w:w="90" w:type="dxa"/>
+              <w:right w:w="90" w:type="dxa"/>
+            </w:tcMar>
+          </w:tcPr>
+          <w:p>
+            <w:pPr>
+              <w:jc w:val="center"/>
+            </w:pPr>
+            <w:r>
+              <w:rPr>
+                <w:rFonts w:ascii="Times New Roman" w:hAnsi="Times New Roman"/>
+                <w:b/>
+                <w:color w:val="FFFFFF"/>
+                <w:sz w:val="18"/>
+              </w:rPr>
+              <w:t>Qsf (kN)</w:t>
+            </w:r>
+          </w:p>
+        </w:tc>
+      </w:tr>
+      <w:tr>
+        <w:tc>
+          <w:tcPr>
+            <w:tcW w:type="dxa" w:w="2880"/>
+            <w:shd w:fill="FFFFFF"/>
+            <w:tcMar>
+              <w:top w:w="60" w:type="dxa"/>
+              <w:bottom w:w="60" w:type="dxa"/>
+              <w:left w:w="80" w:type="dxa"/>
+              <w:right w:w="80" w:type="dxa"/>
+            </w:tcMar>
+          </w:tcPr>
+          <w:p>
+            <w:pPr>
+              <w:jc w:val="left"/>
+            </w:pPr>
+            <w:r>
+              <w:rPr>
+                <w:rFonts w:ascii="Times New Roman" w:hAnsi="Times New Roman"/>
+                <w:sz w:val="17"/>
+              </w:rPr>
+              <w:t>Lớp 1: Bùn sét màu xám đen, trạng thái chảy</w:t>
+            </w:r>
+          </w:p>
+        </w:tc>
+        <w:tc>
+          <w:tcPr>
+            <w:tcW w:type="dxa" w:w="1296"/>
+            <w:shd w:fill="FFFFFF"/>
+            <w:tcMar>
+              <w:top w:w="60" w:type="dxa"/>
+              <w:bottom w:w="60" w:type="dxa"/>
+              <w:left w:w="80" w:type="dxa"/>
+              <w:right w:w="80" w:type="dxa"/>
+            </w:tcMar>
+          </w:tcPr>
+          <w:p>
+            <w:pPr>
+              <w:jc w:val="right"/>
+            </w:pPr>
+            <w:r>
+              <w:rPr>
+                <w:rFonts w:ascii="Times New Roman" w:hAnsi="Times New Roman"/>
+                <w:sz w:val="17"/>
+              </w:rPr>
+              <w:t>-5.00</w:t>
+            </w:r>
+          </w:p>
+        </w:tc>
+        <w:tc>
+          <w:tcPr>
+            <w:tcW w:type="dxa" w:w="1008"/>
+            <w:shd w:fill="FFFFFF"/>
+            <w:tcMar>
+              <w:top w:w="60" w:type="dxa"/>
+              <w:bottom w:w="60" w:type="dxa"/>
+              <w:left w:w="80" w:type="dxa"/>
+              <w:right w:w="80" w:type="dxa"/>
+            </w:tcMar>
+          </w:tcPr>
+          <w:p>
+            <w:pPr>
+              <w:jc w:val="right"/>
+            </w:pPr>
+            <w:r>
+              <w:rPr>
+                <w:rFonts w:ascii="Times New Roman" w:hAnsi="Times New Roman"/>
+                <w:sz w:val="17"/>
+              </w:rPr>
+              <w:t>5.00</w:t>
+            </w:r>
+          </w:p>
+        </w:tc>
+        <w:tc>
+          <w:tcPr>
+            <w:tcW w:type="dxa" w:w="1296"/>
+            <w:shd w:fill="FFFFFF"/>
+            <w:tcMar>
+              <w:top w:w="60" w:type="dxa"/>
+              <w:bottom w:w="60" w:type="dxa"/>
+              <w:left w:w="80" w:type="dxa"/>
+              <w:right w:w="80" w:type="dxa"/>
+            </w:tcMar>
+          </w:tcPr>
+          <w:p>
+            <w:pPr>
+              <w:jc w:val="right"/>
+            </w:pPr>
+            <w:r>
+              <w:rPr>
+                <w:rFonts w:ascii="Times New Roman" w:hAnsi="Times New Roman"/>
+                <w:sz w:val="17"/>
+              </w:rPr>
+              <w:t>Sét/đất dính</w:t>
+            </w:r>
+          </w:p>
+        </w:tc>
+        <w:tc>
+          <w:tcPr>
+            <w:tcW w:type="dxa" w:w="864"/>
+            <w:shd w:fill="FFFFFF"/>
+            <w:tcMar>
+              <w:top w:w="60" w:type="dxa"/>
+              <w:bottom w:w="60" w:type="dxa"/>
+              <w:left w:w="80" w:type="dxa"/>
+              <w:right w:w="80" w:type="dxa"/>
+            </w:tcMar>
+          </w:tcPr>
+          <w:p>
+            <w:pPr>
+              <w:jc w:val="right"/>
+            </w:pPr>
+            <w:r>
+              <w:rPr>
+                <w:rFonts w:ascii="Times New Roman" w:hAnsi="Times New Roman"/>
+                <w:sz w:val="17"/>
+              </w:rPr>
+              <w:t>2</w:t>
+            </w:r>
+          </w:p>
+        </w:tc>
+        <w:tc>
+          <w:tcPr>
+            <w:tcW w:type="dxa" w:w="1008"/>
+            <w:shd w:fill="FFFFFF"/>
+            <w:tcMar>
+              <w:top w:w="60" w:type="dxa"/>
+              <w:bottom w:w="60" w:type="dxa"/>
+              <w:left w:w="80" w:type="dxa"/>
+              <w:right w:w="80" w:type="dxa"/>
+            </w:tcMar>
+          </w:tcPr>
+          <w:p>
+            <w:pPr>
+              <w:jc w:val="right"/>
+            </w:pPr>
+            <w:r>
+              <w:rPr>
+                <w:rFonts w:ascii="Times New Roman" w:hAnsi="Times New Roman"/>
+                <w:sz w:val="17"/>
+              </w:rPr>
+              <w:t>6.7</w:t>
+            </w:r>
+          </w:p>
+        </w:tc>
+        <w:tc>
+          <w:tcPr>
+            <w:tcW w:type="dxa" w:w="1728"/>
+            <w:shd w:fill="FFFFFF"/>
+            <w:tcMar>
+              <w:top w:w="60" w:type="dxa"/>
+              <w:bottom w:w="60" w:type="dxa"/>
+              <w:left w:w="80" w:type="dxa"/>
+              <w:right w:w="80" w:type="dxa"/>
+            </w:tcMar>
+          </w:tcPr>
+          <w:p>
+            <w:pPr>
+              <w:jc w:val="right"/>
+            </w:pPr>
+            <w:r>
+              <w:rPr>
+                <w:rFonts w:ascii="Times New Roman" w:hAnsi="Times New Roman"/>
+                <w:sz w:val="17"/>
+              </w:rPr>
+              <w:t>0.015 / 5.0°</w:t>
+            </w:r>
+          </w:p>
+        </w:tc>
+        <w:tc>
+          <w:tcPr>
+            <w:tcW w:type="dxa" w:w="1152"/>
+            <w:shd w:fill="FFFFFF"/>
+            <w:tcMar>
+              <w:top w:w="60" w:type="dxa"/>
+              <w:bottom w:w="60" w:type="dxa"/>
+              <w:left w:w="80" w:type="dxa"/>
+              <w:right w:w="80" w:type="dxa"/>
+            </w:tcMar>
+          </w:tcPr>
+          <w:p>
+            <w:pPr>
+              <w:jc w:val="right"/>
+            </w:pPr>
+            <w:r>
+              <w:rPr>
+                <w:rFonts w:ascii="Times New Roman" w:hAnsi="Times New Roman"/>
+                <w:sz w:val="17"/>
+              </w:rPr>
+              <w:t>87.1</w:t>
+            </w:r>
+          </w:p>
+        </w:tc>
+        <w:tc>
+          <w:tcPr>
+            <w:tcW w:type="dxa" w:w="1152"/>
+            <w:shd w:fill="FFFFFF"/>
+            <w:tcMar>
+              <w:top w:w="60" w:type="dxa"/>
+              <w:bottom w:w="60" w:type="dxa"/>
+              <w:left w:w="80" w:type="dxa"/>
+              <w:right w:w="80" w:type="dxa"/>
+            </w:tcMar>
+          </w:tcPr>
+          <w:p>
+            <w:pPr>
+              <w:jc w:val="right"/>
+            </w:pPr>
+            <w:r>
+              <w:rPr>
+                <w:rFonts w:ascii="Times New Roman" w:hAnsi="Times New Roman"/>
+                <w:sz w:val="17"/>
+              </w:rPr>
+              <w:t>39.2</w:t>
+            </w:r>
+          </w:p>
+        </w:tc>
+      </w:tr>
+      <w:tr>
+        <w:tc>
+          <w:tcPr>
+            <w:tcW w:type="dxa" w:w="2880"/>
+            <w:shd w:fill="F2F5F9"/>
+            <w:tcMar>
+              <w:top w:w="60" w:type="dxa"/>
+              <w:bottom w:w="60" w:type="dxa"/>
+              <w:left w:w="80" w:type="dxa"/>
+              <w:right w:w="80" w:type="dxa"/>
+            </w:tcMar>
+          </w:tcPr>
+          <w:p>
+            <w:pPr>
+              <w:jc w:val="left"/>
+            </w:pPr>
+            <w:r>
+              <w:rPr>
+                <w:rFonts w:ascii="Times New Roman" w:hAnsi="Times New Roman"/>
+                <w:sz w:val="17"/>
+              </w:rPr>
+              <w:t>Lớp 2: Sét pha dẻo mềm, xám nâu</w:t>
+            </w:r>
+          </w:p>
+        </w:tc>
+        <w:tc>
+          <w:tcPr>
+            <w:tcW w:type="dxa" w:w="1296"/>
+            <w:shd w:fill="F2F5F9"/>
+            <w:tcMar>
+              <w:top w:w="60" w:type="dxa"/>
+              <w:bottom w:w="60" w:type="dxa"/>
+              <w:left w:w="80" w:type="dxa"/>
+              <w:right w:w="80" w:type="dxa"/>
+            </w:tcMar>
+          </w:tcPr>
+          <w:p>
+            <w:pPr>
+              <w:jc w:val="right"/>
+            </w:pPr>
+            <w:r>
+              <w:rPr>
+                <w:rFonts w:ascii="Times New Roman" w:hAnsi="Times New Roman"/>
+                <w:sz w:val="17"/>
+              </w:rPr>
+              <w:t>-15.00</w:t>
+            </w:r>
+          </w:p>
+        </w:tc>
+        <w:tc>
+          <w:tcPr>
+            <w:tcW w:type="dxa" w:w="1008"/>
+            <w:shd w:fill="F2F5F9"/>
+            <w:tcMar>
+              <w:top w:w="60" w:type="dxa"/>
+              <w:bottom w:w="60" w:type="dxa"/>
+              <w:left w:w="80" w:type="dxa"/>
+              <w:right w:w="80" w:type="dxa"/>
+            </w:tcMar>
+          </w:tcPr>
+          <w:p>
+            <w:pPr>
+              <w:jc w:val="right"/>
+            </w:pPr>
+            <w:r>
+              <w:rPr>
+                <w:rFonts w:ascii="Times New Roman" w:hAnsi="Times New Roman"/>
+                <w:sz w:val="17"/>
+              </w:rPr>
+              <w:t>10.00</w:t>
+            </w:r>
+          </w:p>
+        </w:tc>
+        <w:tc>
+          <w:tcPr>
+            <w:tcW w:type="dxa" w:w="1296"/>
+            <w:shd w:fill="F2F5F9"/>
+            <w:tcMar>
+              <w:top w:w="60" w:type="dxa"/>
+              <w:bottom w:w="60" w:type="dxa"/>
+              <w:left w:w="80" w:type="dxa"/>
+              <w:right w:w="80" w:type="dxa"/>
+            </w:tcMar>
+          </w:tcPr>
+          <w:p>
+            <w:pPr>
+              <w:jc w:val="right"/>
+            </w:pPr>
+            <w:r>
+              <w:rPr>
+                <w:rFonts w:ascii="Times New Roman" w:hAnsi="Times New Roman"/>
+                <w:sz w:val="17"/>
+              </w:rPr>
+              <w:t>Sét/đất dính</w:t>
+            </w:r>
+          </w:p>
+        </w:tc>
+        <w:tc>
+          <w:tcPr>
+            <w:tcW w:type="dxa" w:w="864"/>
+            <w:shd w:fill="F2F5F9"/>
+            <w:tcMar>
+              <w:top w:w="60" w:type="dxa"/>
+              <w:bottom w:w="60" w:type="dxa"/>
+              <w:left w:w="80" w:type="dxa"/>
+              <w:right w:w="80" w:type="dxa"/>
+            </w:tcMar>
+          </w:tcPr>
+          <w:p>
+            <w:pPr>
+              <w:jc w:val="right"/>
+            </w:pPr>
+            <w:r>
+              <w:rPr>
+                <w:rFonts w:ascii="Times New Roman" w:hAnsi="Times New Roman"/>
+                <w:sz w:val="17"/>
+              </w:rPr>
+              <w:t>6</w:t>
+            </w:r>
+          </w:p>
+        </w:tc>
+        <w:tc>
+          <w:tcPr>
+            <w:tcW w:type="dxa" w:w="1008"/>
+            <w:shd w:fill="F2F5F9"/>
+            <w:tcMar>
+              <w:top w:w="60" w:type="dxa"/>
+              <w:bottom w:w="60" w:type="dxa"/>
+              <w:left w:w="80" w:type="dxa"/>
+              <w:right w:w="80" w:type="dxa"/>
+            </w:tcMar>
+          </w:tcPr>
+          <w:p>
+            <w:pPr>
+              <w:jc w:val="right"/>
+            </w:pPr>
+            <w:r>
+              <w:rPr>
+                <w:rFonts w:ascii="Times New Roman" w:hAnsi="Times New Roman"/>
+                <w:sz w:val="17"/>
+              </w:rPr>
+              <w:t>8.2</w:t>
+            </w:r>
+          </w:p>
+        </w:tc>
+        <w:tc>
+          <w:tcPr>
+            <w:tcW w:type="dxa" w:w="1728"/>
+            <w:shd w:fill="F2F5F9"/>
+            <w:tcMar>
+              <w:top w:w="60" w:type="dxa"/>
+              <w:bottom w:w="60" w:type="dxa"/>
+              <w:left w:w="80" w:type="dxa"/>
+              <w:right w:w="80" w:type="dxa"/>
+            </w:tcMar>
+          </w:tcPr>
+          <w:p>
+            <w:pPr>
+              <w:jc w:val="right"/>
+            </w:pPr>
+            <w:r>
+              <w:rPr>
+                <w:rFonts w:ascii="Times New Roman" w:hAnsi="Times New Roman"/>
+                <w:sz w:val="17"/>
+              </w:rPr>
+              <w:t>0.025 / 12.0°</w:t>
+            </w:r>
+          </w:p>
+        </w:tc>
+        <w:tc>
+          <w:tcPr>
+            <w:tcW w:type="dxa" w:w="1152"/>
+            <w:shd w:fill="F2F5F9"/>
+            <w:tcMar>
+              <w:top w:w="60" w:type="dxa"/>
+              <w:bottom w:w="60" w:type="dxa"/>
+              <w:left w:w="80" w:type="dxa"/>
+              <w:right w:w="80" w:type="dxa"/>
+            </w:tcMar>
+          </w:tcPr>
+          <w:p>
+            <w:pPr>
+              <w:jc w:val="right"/>
+            </w:pPr>
+            <w:r>
+              <w:rPr>
+                <w:rFonts w:ascii="Times New Roman" w:hAnsi="Times New Roman"/>
+                <w:sz w:val="17"/>
+              </w:rPr>
+              <w:t>746.4</w:t>
+            </w:r>
+          </w:p>
+        </w:tc>
+        <w:tc>
+          <w:tcPr>
+            <w:tcW w:type="dxa" w:w="1152"/>
+            <w:shd w:fill="F2F5F9"/>
+            <w:tcMar>
+              <w:top w:w="60" w:type="dxa"/>
+              <w:bottom w:w="60" w:type="dxa"/>
+              <w:left w:w="80" w:type="dxa"/>
+              <w:right w:w="80" w:type="dxa"/>
+            </w:tcMar>
+          </w:tcPr>
+          <w:p>
+            <w:pPr>
+              <w:jc w:val="right"/>
+            </w:pPr>
+            <w:r>
+              <w:rPr>
+                <w:rFonts w:ascii="Times New Roman" w:hAnsi="Times New Roman"/>
+                <w:sz w:val="17"/>
+              </w:rPr>
+              <w:t>335.9</w:t>
+            </w:r>
+          </w:p>
+        </w:tc>
+      </w:tr>
+      <w:tr>
+        <w:tc>
+          <w:tcPr>
+            <w:tcW w:type="dxa" w:w="2880"/>
+            <w:shd w:fill="FFFFFF"/>
+            <w:tcMar>
+              <w:top w:w="60" w:type="dxa"/>
+              <w:bottom w:w="60" w:type="dxa"/>
+              <w:left w:w="80" w:type="dxa"/>
+              <w:right w:w="80" w:type="dxa"/>
+            </w:tcMar>
+          </w:tcPr>
+          <w:p>
+            <w:pPr>
+              <w:jc w:val="left"/>
+            </w:pPr>
+            <w:r>
+              <w:rPr>
+                <w:rFonts w:ascii="Times New Roman" w:hAnsi="Times New Roman"/>
+                <w:sz w:val="17"/>
+              </w:rPr>
+              <w:t>Lớp 3: Cát hạt trung - thô, chặt vừa</w:t>
+            </w:r>
+          </w:p>
+        </w:tc>
+        <w:tc>
+          <w:tcPr>
+            <w:tcW w:type="dxa" w:w="1296"/>
+            <w:shd w:fill="FFFFFF"/>
+            <w:tcMar>
+              <w:top w:w="60" w:type="dxa"/>
+              <w:bottom w:w="60" w:type="dxa"/>
+              <w:left w:w="80" w:type="dxa"/>
+              <w:right w:w="80" w:type="dxa"/>
+            </w:tcMar>
+          </w:tcPr>
+          <w:p>
+            <w:pPr>
+              <w:jc w:val="right"/>
+            </w:pPr>
+            <w:r>
+              <w:rPr>
+                <w:rFonts w:ascii="Times New Roman" w:hAnsi="Times New Roman"/>
+                <w:sz w:val="17"/>
+              </w:rPr>
+              <w:t>-28.00</w:t>
+            </w:r>
+          </w:p>
+        </w:tc>
+        <w:tc>
+          <w:tcPr>
+            <w:tcW w:type="dxa" w:w="1008"/>
+            <w:shd w:fill="FFFFFF"/>
+            <w:tcMar>
+              <w:top w:w="60" w:type="dxa"/>
+              <w:bottom w:w="60" w:type="dxa"/>
+              <w:left w:w="80" w:type="dxa"/>
+              <w:right w:w="80" w:type="dxa"/>
+            </w:tcMar>
+          </w:tcPr>
+          <w:p>
+            <w:pPr>
+              <w:jc w:val="right"/>
+            </w:pPr>
+            <w:r>
+              <w:rPr>
+                <w:rFonts w:ascii="Times New Roman" w:hAnsi="Times New Roman"/>
+                <w:sz w:val="17"/>
+              </w:rPr>
+              <w:t>13.00</w:t>
+            </w:r>
+          </w:p>
+        </w:tc>
+        <w:tc>
+          <w:tcPr>
+            <w:tcW w:type="dxa" w:w="1296"/>
+            <w:shd w:fill="FFFFFF"/>
+            <w:tcMar>
+              <w:top w:w="60" w:type="dxa"/>
+              <w:bottom w:w="60" w:type="dxa"/>
+              <w:left w:w="80" w:type="dxa"/>
+              <w:right w:w="80" w:type="dxa"/>
+            </w:tcMar>
+          </w:tcPr>
+          <w:p>
+            <w:pPr>
+              <w:jc w:val="right"/>
+            </w:pPr>
+            <w:r>
+              <w:rPr>
+                <w:rFonts w:ascii="Times New Roman" w:hAnsi="Times New Roman"/>
+                <w:sz w:val="17"/>
+              </w:rPr>
+              <w:t>Cát/đất rời</w:t>
+            </w:r>
+          </w:p>
+        </w:tc>
+        <w:tc>
+          <w:tcPr>
+            <w:tcW w:type="dxa" w:w="864"/>
+            <w:shd w:fill="FFFFFF"/>
+            <w:tcMar>
+              <w:top w:w="60" w:type="dxa"/>
+              <w:bottom w:w="60" w:type="dxa"/>
+              <w:left w:w="80" w:type="dxa"/>
+              <w:right w:w="80" w:type="dxa"/>
+            </w:tcMar>
+          </w:tcPr>
+          <w:p>
+            <w:pPr>
+              <w:jc w:val="right"/>
+            </w:pPr>
+            <w:r>
+              <w:rPr>
+                <w:rFonts w:ascii="Times New Roman" w:hAnsi="Times New Roman"/>
+                <w:sz w:val="17"/>
+              </w:rPr>
+              <w:t>25</w:t>
+            </w:r>
+          </w:p>
+        </w:tc>
+        <w:tc>
+          <w:tcPr>
+            <w:tcW w:type="dxa" w:w="1008"/>
+            <w:shd w:fill="FFFFFF"/>
+            <w:tcMar>
+              <w:top w:w="60" w:type="dxa"/>
+              <w:bottom w:w="60" w:type="dxa"/>
+              <w:left w:w="80" w:type="dxa"/>
+              <w:right w:w="80" w:type="dxa"/>
+            </w:tcMar>
+          </w:tcPr>
+          <w:p>
+            <w:pPr>
+              <w:jc w:val="right"/>
+            </w:pPr>
+            <w:r>
+              <w:rPr>
+                <w:rFonts w:ascii="Times New Roman" w:hAnsi="Times New Roman"/>
+                <w:sz w:val="17"/>
+              </w:rPr>
+              <w:t>9.7</w:t>
+            </w:r>
+          </w:p>
+        </w:tc>
+        <w:tc>
+          <w:tcPr>
+            <w:tcW w:type="dxa" w:w="1728"/>
+            <w:shd w:fill="FFFFFF"/>
+            <w:tcMar>
+              <w:top w:w="60" w:type="dxa"/>
+              <w:bottom w:w="60" w:type="dxa"/>
+              <w:left w:w="80" w:type="dxa"/>
+              <w:right w:w="80" w:type="dxa"/>
+            </w:tcMar>
+          </w:tcPr>
+          <w:p>
+            <w:pPr>
+              <w:jc w:val="right"/>
+            </w:pPr>
+            <w:r>
+              <w:rPr>
+                <w:rFonts w:ascii="Times New Roman" w:hAnsi="Times New Roman"/>
+                <w:sz w:val="17"/>
+              </w:rPr>
+              <w:t>0.000 / 38.9°</w:t>
+            </w:r>
+          </w:p>
+        </w:tc>
+        <w:tc>
+          <w:tcPr>
+            <w:tcW w:type="dxa" w:w="1152"/>
+            <w:shd w:fill="FFFFFF"/>
+            <w:tcMar>
+              <w:top w:w="60" w:type="dxa"/>
+              <w:bottom w:w="60" w:type="dxa"/>
+              <w:left w:w="80" w:type="dxa"/>
+              <w:right w:w="80" w:type="dxa"/>
+            </w:tcMar>
+          </w:tcPr>
+          <w:p>
+            <w:pPr>
+              <w:jc w:val="right"/>
+            </w:pPr>
+            <w:r>
+              <w:rPr>
+                <w:rFonts w:ascii="Times New Roman" w:hAnsi="Times New Roman"/>
+                <w:sz w:val="17"/>
+              </w:rPr>
+              <w:t>4300.0</w:t>
+            </w:r>
+          </w:p>
+        </w:tc>
+        <w:tc>
+          <w:tcPr>
+            <w:tcW w:type="dxa" w:w="1152"/>
+            <w:shd w:fill="FFFFFF"/>
+            <w:tcMar>
+              <w:top w:w="60" w:type="dxa"/>
+              <w:bottom w:w="60" w:type="dxa"/>
+              <w:left w:w="80" w:type="dxa"/>
+              <w:right w:w="80" w:type="dxa"/>
+            </w:tcMar>
+          </w:tcPr>
+          <w:p>
+            <w:pPr>
+              <w:jc w:val="right"/>
+            </w:pPr>
+            <w:r>
+              <w:rPr>
+                <w:rFonts w:ascii="Times New Roman" w:hAnsi="Times New Roman"/>
+                <w:sz w:val="17"/>
+              </w:rPr>
+              <w:t>2365.0</w:t>
+            </w:r>
+          </w:p>
+        </w:tc>
+      </w:tr>
+      <w:tr>
+        <w:tc>
+          <w:tcPr>
+            <w:tcW w:type="dxa" w:w="2880"/>
+            <w:shd w:fill="F2F5F9"/>
+            <w:tcMar>
+              <w:top w:w="60" w:type="dxa"/>
+              <w:bottom w:w="60" w:type="dxa"/>
+              <w:left w:w="80" w:type="dxa"/>
+              <w:right w:w="80" w:type="dxa"/>
+            </w:tcMar>
+          </w:tcPr>
+          <w:p>
+            <w:pPr>
+              <w:jc w:val="left"/>
+            </w:pPr>
+            <w:r>
+              <w:rPr>
+                <w:rFonts w:ascii="Times New Roman" w:hAnsi="Times New Roman"/>
+                <w:sz w:val="17"/>
+              </w:rPr>
+              <w:t>Lớp 4: Sét cứng/Đá phong hóa mạnh (IGM)</w:t>
+            </w:r>
+          </w:p>
+        </w:tc>
+        <w:tc>
+          <w:tcPr>
+            <w:tcW w:type="dxa" w:w="1296"/>
+            <w:shd w:fill="F2F5F9"/>
+            <w:tcMar>
+              <w:top w:w="60" w:type="dxa"/>
+              <w:bottom w:w="60" w:type="dxa"/>
+              <w:left w:w="80" w:type="dxa"/>
+              <w:right w:w="80" w:type="dxa"/>
+            </w:tcMar>
+          </w:tcPr>
+          <w:p>
+            <w:pPr>
+              <w:jc w:val="right"/>
+            </w:pPr>
+            <w:r>
+              <w:rPr>
+                <w:rFonts w:ascii="Times New Roman" w:hAnsi="Times New Roman"/>
+                <w:sz w:val="17"/>
+              </w:rPr>
+              <w:t>-35.00</w:t>
+            </w:r>
+          </w:p>
+        </w:tc>
+        <w:tc>
+          <w:tcPr>
+            <w:tcW w:type="dxa" w:w="1008"/>
+            <w:shd w:fill="F2F5F9"/>
+            <w:tcMar>
+              <w:top w:w="60" w:type="dxa"/>
+              <w:bottom w:w="60" w:type="dxa"/>
+              <w:left w:w="80" w:type="dxa"/>
+              <w:right w:w="80" w:type="dxa"/>
+            </w:tcMar>
+          </w:tcPr>
+          <w:p>
+            <w:pPr>
+              <w:jc w:val="right"/>
+            </w:pPr>
+            <w:r>
+              <w:rPr>
+                <w:rFonts w:ascii="Times New Roman" w:hAnsi="Times New Roman"/>
+                <w:sz w:val="17"/>
+              </w:rPr>
+              <w:t>7.00</w:t>
+            </w:r>
+          </w:p>
+        </w:tc>
+        <w:tc>
+          <w:tcPr>
+            <w:tcW w:type="dxa" w:w="1296"/>
+            <w:shd w:fill="F2F5F9"/>
+            <w:tcMar>
+              <w:top w:w="60" w:type="dxa"/>
+              <w:bottom w:w="60" w:type="dxa"/>
+              <w:left w:w="80" w:type="dxa"/>
+              <w:right w:w="80" w:type="dxa"/>
+            </w:tcMar>
+          </w:tcPr>
+          <w:p>
+            <w:pPr>
+              <w:jc w:val="right"/>
+            </w:pPr>
+            <w:r>
+              <w:rPr>
+                <w:rFonts w:ascii="Times New Roman" w:hAnsi="Times New Roman"/>
+                <w:sz w:val="17"/>
+              </w:rPr>
+              <w:t>IGM/đá mềm</w:t>
+            </w:r>
+          </w:p>
+        </w:tc>
+        <w:tc>
+          <w:tcPr>
+            <w:tcW w:type="dxa" w:w="864"/>
+            <w:shd w:fill="F2F5F9"/>
+            <w:tcMar>
+              <w:top w:w="60" w:type="dxa"/>
+              <w:bottom w:w="60" w:type="dxa"/>
+              <w:left w:w="80" w:type="dxa"/>
+              <w:right w:w="80" w:type="dxa"/>
+            </w:tcMar>
+          </w:tcPr>
+          <w:p>
+            <w:pPr>
+              <w:jc w:val="right"/>
+            </w:pPr>
+            <w:r>
+              <w:rPr>
+                <w:rFonts w:ascii="Times New Roman" w:hAnsi="Times New Roman"/>
+                <w:sz w:val="17"/>
+              </w:rPr>
+              <w:t>50</w:t>
+            </w:r>
+          </w:p>
+        </w:tc>
+        <w:tc>
+          <w:tcPr>
+            <w:tcW w:type="dxa" w:w="1008"/>
+            <w:shd w:fill="F2F5F9"/>
+            <w:tcMar>
+              <w:top w:w="60" w:type="dxa"/>
+              <w:bottom w:w="60" w:type="dxa"/>
+              <w:left w:w="80" w:type="dxa"/>
+              <w:right w:w="80" w:type="dxa"/>
+            </w:tcMar>
+          </w:tcPr>
+          <w:p>
+            <w:pPr>
+              <w:jc w:val="right"/>
+            </w:pPr>
+            <w:r>
+              <w:rPr>
+                <w:rFonts w:ascii="Times New Roman" w:hAnsi="Times New Roman"/>
+                <w:sz w:val="17"/>
+              </w:rPr>
+              <w:t>10.2</w:t>
+            </w:r>
+          </w:p>
+        </w:tc>
+        <w:tc>
+          <w:tcPr>
+            <w:tcW w:type="dxa" w:w="1728"/>
+            <w:shd w:fill="F2F5F9"/>
+            <w:tcMar>
+              <w:top w:w="60" w:type="dxa"/>
+              <w:bottom w:w="60" w:type="dxa"/>
+              <w:left w:w="80" w:type="dxa"/>
+              <w:right w:w="80" w:type="dxa"/>
+            </w:tcMar>
+          </w:tcPr>
+          <w:p>
+            <w:pPr>
+              <w:jc w:val="right"/>
+            </w:pPr>
+            <w:r>
+              <w:rPr>
+                <w:rFonts w:ascii="Times New Roman" w:hAnsi="Times New Roman"/>
+                <w:sz w:val="17"/>
+              </w:rPr>
+              <w:t>0.080 / 22.0°</w:t>
+            </w:r>
+          </w:p>
+        </w:tc>
+        <w:tc>
+          <w:tcPr>
+            <w:tcW w:type="dxa" w:w="1152"/>
+            <w:shd w:fill="F2F5F9"/>
+            <w:tcMar>
+              <w:top w:w="60" w:type="dxa"/>
+              <w:bottom w:w="60" w:type="dxa"/>
+              <w:left w:w="80" w:type="dxa"/>
+              <w:right w:w="80" w:type="dxa"/>
+            </w:tcMar>
+          </w:tcPr>
+          <w:p>
+            <w:pPr>
+              <w:jc w:val="right"/>
+            </w:pPr>
+            <w:r>
+              <w:rPr>
+                <w:rFonts w:ascii="Times New Roman" w:hAnsi="Times New Roman"/>
+                <w:sz w:val="17"/>
+              </w:rPr>
+              <w:t>4750.1</w:t>
+            </w:r>
+          </w:p>
+        </w:tc>
+        <w:tc>
+          <w:tcPr>
+            <w:tcW w:type="dxa" w:w="1152"/>
+            <w:shd w:fill="F2F5F9"/>
+            <w:tcMar>
+              <w:top w:w="60" w:type="dxa"/>
+              <w:bottom w:w="60" w:type="dxa"/>
+              <w:left w:w="80" w:type="dxa"/>
+              <w:right w:w="80" w:type="dxa"/>
+            </w:tcMar>
+          </w:tcPr>
+          <w:p>
+            <w:pPr>
+              <w:jc w:val="right"/>
+            </w:pPr>
+            <w:r>
+              <w:rPr>
+                <w:rFonts w:ascii="Times New Roman" w:hAnsi="Times New Roman"/>
+                <w:sz w:val="17"/>
+              </w:rPr>
+              <w:t>3325.1</w:t>
+            </w:r>
+          </w:p>
+        </w:tc>
+      </w:tr>
+    </w:tbl>
+    <w:p/>
+    <w:p>
+      <w:pPr>
+        <w:pStyle w:val="Heading1"/>
+      </w:pPr>
+      <w:r>
+        <w:rPr>
+          <w:color w:val="1F4E79"/>
+        </w:rPr>
+        <w:t>CHƯƠNG 6. PHÂN TÍCH VÀ KIỂM TOÁN NỘI LỰC MÓNG CỌC (PHƯƠNG PHÁP MA TRẬN ĐỘ CỨNG TS_PILE)</w:t>
       </w:r>
     </w:p>
     <w:p>
@@ -12731,7 +14038,7 @@
                 <w:rFonts w:ascii="Times New Roman" w:hAnsi="Times New Roman"/>
                 <w:sz w:val="17"/>
               </w:rPr>
-              <w:t>6300.0</w:t>
+              <w:t>6710.2</w:t>
             </w:r>
           </w:p>
         </w:tc>
@@ -12755,7 +14062,7 @@
                 <w:rFonts w:ascii="Times New Roman" w:hAnsi="Times New Roman"/>
                 <w:sz w:val="17"/>
               </w:rPr>
-              <w:t>0.96</w:t>
+              <w:t>0.90</w:t>
             </w:r>
           </w:p>
         </w:tc>
@@ -12929,7 +14236,7 @@
                 <w:rFonts w:ascii="Times New Roman" w:hAnsi="Times New Roman"/>
                 <w:sz w:val="17"/>
               </w:rPr>
-              <w:t>6300.0</w:t>
+              <w:t>6710.2</w:t>
             </w:r>
           </w:p>
         </w:tc>
@@ -12953,7 +14260,7 @@
                 <w:rFonts w:ascii="Times New Roman" w:hAnsi="Times New Roman"/>
                 <w:sz w:val="17"/>
               </w:rPr>
-              <w:t>0.99</w:t>
+              <w:t>0.93</w:t>
             </w:r>
           </w:p>
         </w:tc>
@@ -13127,7 +14434,7 @@
                 <w:rFonts w:ascii="Times New Roman" w:hAnsi="Times New Roman"/>
                 <w:sz w:val="17"/>
               </w:rPr>
-              <w:t>6300.0</w:t>
+              <w:t>6710.2</w:t>
             </w:r>
           </w:p>
         </w:tc>
@@ -13151,7 +14458,7 @@
                 <w:rFonts w:ascii="Times New Roman" w:hAnsi="Times New Roman"/>
                 <w:sz w:val="17"/>
               </w:rPr>
-              <w:t>1.00</w:t>
+              <w:t>0.94</w:t>
             </w:r>
           </w:p>
         </w:tc>
@@ -13325,7 +14632,7 @@
                 <w:rFonts w:ascii="Times New Roman" w:hAnsi="Times New Roman"/>
                 <w:sz w:val="17"/>
               </w:rPr>
-              <w:t>6300.0</w:t>
+              <w:t>6710.2</w:t>
             </w:r>
           </w:p>
         </w:tc>
@@ -13349,7 +14656,7 @@
                 <w:rFonts w:ascii="Times New Roman" w:hAnsi="Times New Roman"/>
                 <w:sz w:val="17"/>
               </w:rPr>
-              <w:t>0.99</w:t>
+              <w:t>0.93</w:t>
             </w:r>
           </w:p>
         </w:tc>
@@ -13523,7 +14830,7 @@
                 <w:rFonts w:ascii="Times New Roman" w:hAnsi="Times New Roman"/>
                 <w:sz w:val="17"/>
               </w:rPr>
-              <w:t>6300.0</w:t>
+              <w:t>6710.2</w:t>
             </w:r>
           </w:p>
         </w:tc>
@@ -13547,7 +14854,7 @@
                 <w:rFonts w:ascii="Times New Roman" w:hAnsi="Times New Roman"/>
                 <w:sz w:val="17"/>
               </w:rPr>
-              <w:t>0.99</w:t>
+              <w:t>0.93</w:t>
             </w:r>
           </w:p>
         </w:tc>
@@ -13721,7 +15028,7 @@
                 <w:rFonts w:ascii="Times New Roman" w:hAnsi="Times New Roman"/>
                 <w:sz w:val="17"/>
               </w:rPr>
-              <w:t>6300.0</w:t>
+              <w:t>6710.2</w:t>
             </w:r>
           </w:p>
         </w:tc>
@@ -13745,7 +15052,7 @@
                 <w:rFonts w:ascii="Times New Roman" w:hAnsi="Times New Roman"/>
                 <w:sz w:val="17"/>
               </w:rPr>
-              <w:t>0.99</w:t>
+              <w:t>0.93</w:t>
             </w:r>
           </w:p>
         </w:tc>
@@ -13919,7 +15226,7 @@
                 <w:rFonts w:ascii="Times New Roman" w:hAnsi="Times New Roman"/>
                 <w:sz w:val="17"/>
               </w:rPr>
-              <w:t>6300.0</w:t>
+              <w:t>6710.2</w:t>
             </w:r>
           </w:p>
         </w:tc>
@@ -13943,7 +15250,7 @@
                 <w:rFonts w:ascii="Times New Roman" w:hAnsi="Times New Roman"/>
                 <w:sz w:val="17"/>
               </w:rPr>
-              <w:t>0.93</w:t>
+              <w:t>0.87</w:t>
             </w:r>
           </w:p>
         </w:tc>
@@ -14117,7 +15424,7 @@
                 <w:rFonts w:ascii="Times New Roman" w:hAnsi="Times New Roman"/>
                 <w:sz w:val="17"/>
               </w:rPr>
-              <w:t>6300.0</w:t>
+              <w:t>6710.2</w:t>
             </w:r>
           </w:p>
         </w:tc>
@@ -14141,7 +15448,7 @@
                 <w:rFonts w:ascii="Times New Roman" w:hAnsi="Times New Roman"/>
                 <w:sz w:val="17"/>
               </w:rPr>
-              <w:t>0.95</w:t>
+              <w:t>0.89</w:t>
             </w:r>
           </w:p>
         </w:tc>
@@ -14315,7 +15622,7 @@
                 <w:rFonts w:ascii="Times New Roman" w:hAnsi="Times New Roman"/>
                 <w:sz w:val="17"/>
               </w:rPr>
-              <w:t>6300.0</w:t>
+              <w:t>6710.2</w:t>
             </w:r>
           </w:p>
         </w:tc>
@@ -14339,7 +15646,7 @@
                 <w:rFonts w:ascii="Times New Roman" w:hAnsi="Times New Roman"/>
                 <w:sz w:val="17"/>
               </w:rPr>
-              <w:t>0.96</w:t>
+              <w:t>0.90</w:t>
             </w:r>
           </w:p>
         </w:tc>
@@ -14513,7 +15820,7 @@
                 <w:rFonts w:ascii="Times New Roman" w:hAnsi="Times New Roman"/>
                 <w:sz w:val="17"/>
               </w:rPr>
-              <w:t>6300.0</w:t>
+              <w:t>6710.2</w:t>
             </w:r>
           </w:p>
         </w:tc>
@@ -14537,7 +15844,7 @@
                 <w:rFonts w:ascii="Times New Roman" w:hAnsi="Times New Roman"/>
                 <w:sz w:val="17"/>
               </w:rPr>
-              <w:t>0.96</w:t>
+              <w:t>0.90</w:t>
             </w:r>
           </w:p>
         </w:tc>
@@ -14711,7 +16018,7 @@
                 <w:rFonts w:ascii="Times New Roman" w:hAnsi="Times New Roman"/>
                 <w:sz w:val="17"/>
               </w:rPr>
-              <w:t>6300.0</w:t>
+              <w:t>6710.2</w:t>
             </w:r>
           </w:p>
         </w:tc>
@@ -14735,7 +16042,7 @@
                 <w:rFonts w:ascii="Times New Roman" w:hAnsi="Times New Roman"/>
                 <w:sz w:val="17"/>
               </w:rPr>
-              <w:t>0.97</w:t>
+              <w:t>0.91</w:t>
             </w:r>
           </w:p>
         </w:tc>
@@ -14909,7 +16216,7 @@
                 <w:rFonts w:ascii="Times New Roman" w:hAnsi="Times New Roman"/>
                 <w:sz w:val="17"/>
               </w:rPr>
-              <w:t>6300.0</w:t>
+              <w:t>6710.2</w:t>
             </w:r>
           </w:p>
         </w:tc>
@@ -14933,7 +16240,7 @@
                 <w:rFonts w:ascii="Times New Roman" w:hAnsi="Times New Roman"/>
                 <w:sz w:val="17"/>
               </w:rPr>
-              <w:t>0.99</w:t>
+              <w:t>0.93</w:t>
             </w:r>
           </w:p>
         </w:tc>
@@ -15107,7 +16414,7 @@
                 <w:rFonts w:ascii="Times New Roman" w:hAnsi="Times New Roman"/>
                 <w:sz w:val="17"/>
               </w:rPr>
-              <w:t>6300.0</w:t>
+              <w:t>6710.2</w:t>
             </w:r>
           </w:p>
         </w:tc>
@@ -15131,7 +16438,7 @@
                 <w:rFonts w:ascii="Times New Roman" w:hAnsi="Times New Roman"/>
                 <w:sz w:val="17"/>
               </w:rPr>
-              <w:t>0.84</w:t>
+              <w:t>0.79</w:t>
             </w:r>
           </w:p>
         </w:tc>
@@ -15305,7 +16612,7 @@
                 <w:rFonts w:ascii="Times New Roman" w:hAnsi="Times New Roman"/>
                 <w:sz w:val="17"/>
               </w:rPr>
-              <w:t>6300.0</w:t>
+              <w:t>6710.2</w:t>
             </w:r>
           </w:p>
         </w:tc>
@@ -15329,7 +16636,7 @@
                 <w:rFonts w:ascii="Times New Roman" w:hAnsi="Times New Roman"/>
                 <w:sz w:val="17"/>
               </w:rPr>
-              <w:t>0.86</w:t>
+              <w:t>0.81</w:t>
             </w:r>
           </w:p>
         </w:tc>
@@ -15503,7 +16810,7 @@
                 <w:rFonts w:ascii="Times New Roman" w:hAnsi="Times New Roman"/>
                 <w:sz w:val="17"/>
               </w:rPr>
-              <w:t>6300.0</w:t>
+              <w:t>6710.2</w:t>
             </w:r>
           </w:p>
         </w:tc>
@@ -15527,7 +16834,7 @@
                 <w:rFonts w:ascii="Times New Roman" w:hAnsi="Times New Roman"/>
                 <w:sz w:val="17"/>
               </w:rPr>
-              <w:t>0.87</w:t>
+              <w:t>0.82</w:t>
             </w:r>
           </w:p>
         </w:tc>
@@ -15701,7 +17008,7 @@
                 <w:rFonts w:ascii="Times New Roman" w:hAnsi="Times New Roman"/>
                 <w:sz w:val="17"/>
               </w:rPr>
-              <w:t>6300.0</w:t>
+              <w:t>6710.2</w:t>
             </w:r>
           </w:p>
         </w:tc>
@@ -15725,7 +17032,7 @@
                 <w:rFonts w:ascii="Times New Roman" w:hAnsi="Times New Roman"/>
                 <w:sz w:val="17"/>
               </w:rPr>
-              <w:t>0.86</w:t>
+              <w:t>0.81</w:t>
             </w:r>
           </w:p>
         </w:tc>
@@ -15899,7 +17206,7 @@
                 <w:rFonts w:ascii="Times New Roman" w:hAnsi="Times New Roman"/>
                 <w:sz w:val="17"/>
               </w:rPr>
-              <w:t>6300.0</w:t>
+              <w:t>6710.2</w:t>
             </w:r>
           </w:p>
         </w:tc>
@@ -15923,7 +17230,7 @@
                 <w:rFonts w:ascii="Times New Roman" w:hAnsi="Times New Roman"/>
                 <w:sz w:val="17"/>
               </w:rPr>
-              <w:t>0.87</w:t>
+              <w:t>0.81</w:t>
             </w:r>
           </w:p>
         </w:tc>
@@ -16097,7 +17404,7 @@
                 <w:rFonts w:ascii="Times New Roman" w:hAnsi="Times New Roman"/>
                 <w:sz w:val="17"/>
               </w:rPr>
-              <w:t>6300.0</w:t>
+              <w:t>6710.2</w:t>
             </w:r>
           </w:p>
         </w:tc>
@@ -16121,7 +17428,7 @@
                 <w:rFonts w:ascii="Times New Roman" w:hAnsi="Times New Roman"/>
                 <w:sz w:val="17"/>
               </w:rPr>
-              <w:t>0.86</w:t>
+              <w:t>0.81</w:t>
             </w:r>
           </w:p>
         </w:tc>
@@ -16295,7 +17602,7 @@
                 <w:rFonts w:ascii="Times New Roman" w:hAnsi="Times New Roman"/>
                 <w:sz w:val="17"/>
               </w:rPr>
-              <w:t>6300.0</w:t>
+              <w:t>6710.2</w:t>
             </w:r>
           </w:p>
         </w:tc>
@@ -16319,7 +17626,7 @@
                 <w:rFonts w:ascii="Times New Roman" w:hAnsi="Times New Roman"/>
                 <w:sz w:val="17"/>
               </w:rPr>
-              <w:t>0.85</w:t>
+              <w:t>0.79</w:t>
             </w:r>
           </w:p>
         </w:tc>
@@ -16493,7 +17800,7 @@
                 <w:rFonts w:ascii="Times New Roman" w:hAnsi="Times New Roman"/>
                 <w:sz w:val="17"/>
               </w:rPr>
-              <w:t>6300.0</w:t>
+              <w:t>6710.2</w:t>
             </w:r>
           </w:p>
         </w:tc>
@@ -16517,7 +17824,7 @@
                 <w:rFonts w:ascii="Times New Roman" w:hAnsi="Times New Roman"/>
                 <w:sz w:val="17"/>
               </w:rPr>
-              <w:t>0.72</w:t>
+              <w:t>0.68</w:t>
             </w:r>
           </w:p>
         </w:tc>
@@ -16691,7 +17998,7 @@
                 <w:rFonts w:ascii="Times New Roman" w:hAnsi="Times New Roman"/>
                 <w:sz w:val="17"/>
               </w:rPr>
-              <w:t>6300.0</w:t>
+              <w:t>6710.2</w:t>
             </w:r>
           </w:p>
         </w:tc>
@@ -16715,7 +18022,7 @@
                 <w:rFonts w:ascii="Times New Roman" w:hAnsi="Times New Roman"/>
                 <w:sz w:val="17"/>
               </w:rPr>
-              <w:t>0.91</w:t>
+              <w:t>0.86</w:t>
             </w:r>
           </w:p>
         </w:tc>
@@ -16889,7 +18196,7 @@
                 <w:rFonts w:ascii="Times New Roman" w:hAnsi="Times New Roman"/>
                 <w:sz w:val="17"/>
               </w:rPr>
-              <w:t>6300.0</w:t>
+              <w:t>6710.2</w:t>
             </w:r>
           </w:p>
         </w:tc>
@@ -16913,7 +18220,7 @@
                 <w:rFonts w:ascii="Times New Roman" w:hAnsi="Times New Roman"/>
                 <w:sz w:val="17"/>
               </w:rPr>
-              <w:t>0.94</w:t>
+              <w:t>0.88</w:t>
             </w:r>
           </w:p>
         </w:tc>
@@ -17087,7 +18394,7 @@
                 <w:rFonts w:ascii="Times New Roman" w:hAnsi="Times New Roman"/>
                 <w:sz w:val="17"/>
               </w:rPr>
-              <w:t>6300.0</w:t>
+              <w:t>6710.2</w:t>
             </w:r>
           </w:p>
         </w:tc>
@@ -17111,7 +18418,7 @@
                 <w:rFonts w:ascii="Times New Roman" w:hAnsi="Times New Roman"/>
                 <w:sz w:val="17"/>
               </w:rPr>
-              <w:t>0.95</w:t>
+              <w:t>0.90</w:t>
             </w:r>
           </w:p>
         </w:tc>
@@ -17285,7 +18592,7 @@
                 <w:rFonts w:ascii="Times New Roman" w:hAnsi="Times New Roman"/>
                 <w:sz w:val="17"/>
               </w:rPr>
-              <w:t>4500.0</w:t>
+              <w:t>10927.1</w:t>
             </w:r>
           </w:p>
         </w:tc>
@@ -17309,7 +18616,7 @@
                 <w:rFonts w:ascii="Times New Roman" w:hAnsi="Times New Roman"/>
                 <w:sz w:val="17"/>
               </w:rPr>
-              <w:t>0.99</w:t>
+              <w:t>0.41</w:t>
             </w:r>
           </w:p>
         </w:tc>
@@ -17483,7 +18790,7 @@
                 <w:rFonts w:ascii="Times New Roman" w:hAnsi="Times New Roman"/>
                 <w:sz w:val="17"/>
               </w:rPr>
-              <w:t>4500.0</w:t>
+              <w:t>10927.1</w:t>
             </w:r>
           </w:p>
         </w:tc>
@@ -17507,7 +18814,7 @@
                 <w:rFonts w:ascii="Times New Roman" w:hAnsi="Times New Roman"/>
                 <w:sz w:val="17"/>
               </w:rPr>
-              <w:t>1.01</w:t>
+              <w:t>0.42</w:t>
             </w:r>
           </w:p>
         </w:tc>
@@ -17530,10 +18837,10 @@
               <w:rPr>
                 <w:rFonts w:ascii="Times New Roman" w:hAnsi="Times New Roman"/>
                 <w:b/>
-                <w:color w:val="C80000"/>
-                <w:sz w:val="17"/>
-              </w:rPr>
-              <w:t>VƯỢT TẢI</w:t>
+                <w:color w:val="008000"/>
+                <w:sz w:val="17"/>
+              </w:rPr>
+              <w:t>ĐẠT</w:t>
             </w:r>
           </w:p>
         </w:tc>
@@ -17681,7 +18988,7 @@
                 <w:rFonts w:ascii="Times New Roman" w:hAnsi="Times New Roman"/>
                 <w:sz w:val="17"/>
               </w:rPr>
-              <w:t>4500.0</w:t>
+              <w:t>10927.1</w:t>
             </w:r>
           </w:p>
         </w:tc>
@@ -17705,7 +19012,7 @@
                 <w:rFonts w:ascii="Times New Roman" w:hAnsi="Times New Roman"/>
                 <w:sz w:val="17"/>
               </w:rPr>
-              <w:t>1.02</w:t>
+              <w:t>0.42</w:t>
             </w:r>
           </w:p>
         </w:tc>
@@ -17728,10 +19035,10 @@
               <w:rPr>
                 <w:rFonts w:ascii="Times New Roman" w:hAnsi="Times New Roman"/>
                 <w:b/>
-                <w:color w:val="C80000"/>
-                <w:sz w:val="17"/>
-              </w:rPr>
-              <w:t>VƯỢT TẢI</w:t>
+                <w:color w:val="008000"/>
+                <w:sz w:val="17"/>
+              </w:rPr>
+              <w:t>ĐẠT</w:t>
             </w:r>
           </w:p>
         </w:tc>
@@ -17879,7 +19186,7 @@
                 <w:rFonts w:ascii="Times New Roman" w:hAnsi="Times New Roman"/>
                 <w:sz w:val="17"/>
               </w:rPr>
-              <w:t>4500.0</w:t>
+              <w:t>10927.1</w:t>
             </w:r>
           </w:p>
         </w:tc>
@@ -17903,7 +19210,7 @@
                 <w:rFonts w:ascii="Times New Roman" w:hAnsi="Times New Roman"/>
                 <w:sz w:val="17"/>
               </w:rPr>
-              <w:t>1.01</w:t>
+              <w:t>0.41</w:t>
             </w:r>
           </w:p>
         </w:tc>
@@ -17926,10 +19233,10 @@
               <w:rPr>
                 <w:rFonts w:ascii="Times New Roman" w:hAnsi="Times New Roman"/>
                 <w:b/>
-                <w:color w:val="C80000"/>
-                <w:sz w:val="17"/>
-              </w:rPr>
-              <w:t>VƯỢT TẢI</w:t>
+                <w:color w:val="008000"/>
+                <w:sz w:val="17"/>
+              </w:rPr>
+              <w:t>ĐẠT</w:t>
             </w:r>
           </w:p>
         </w:tc>
@@ -18077,7 +19384,7 @@
                 <w:rFonts w:ascii="Times New Roman" w:hAnsi="Times New Roman"/>
                 <w:sz w:val="17"/>
               </w:rPr>
-              <w:t>4500.0</w:t>
+              <w:t>10927.1</w:t>
             </w:r>
           </w:p>
         </w:tc>
@@ -18101,7 +19408,7 @@
                 <w:rFonts w:ascii="Times New Roman" w:hAnsi="Times New Roman"/>
                 <w:sz w:val="17"/>
               </w:rPr>
-              <w:t>1.01</w:t>
+              <w:t>0.42</w:t>
             </w:r>
           </w:p>
         </w:tc>
@@ -18124,10 +19431,10 @@
               <w:rPr>
                 <w:rFonts w:ascii="Times New Roman" w:hAnsi="Times New Roman"/>
                 <w:b/>
-                <w:color w:val="C80000"/>
-                <w:sz w:val="17"/>
-              </w:rPr>
-              <w:t>VƯỢT TẢI</w:t>
+                <w:color w:val="008000"/>
+                <w:sz w:val="17"/>
+              </w:rPr>
+              <w:t>ĐẠT</w:t>
             </w:r>
           </w:p>
         </w:tc>
@@ -18275,7 +19582,7 @@
                 <w:rFonts w:ascii="Times New Roman" w:hAnsi="Times New Roman"/>
                 <w:sz w:val="17"/>
               </w:rPr>
-              <w:t>4500.0</w:t>
+              <w:t>10927.1</w:t>
             </w:r>
           </w:p>
         </w:tc>
@@ -18299,7 +19606,7 @@
                 <w:rFonts w:ascii="Times New Roman" w:hAnsi="Times New Roman"/>
                 <w:sz w:val="17"/>
               </w:rPr>
-              <w:t>1.01</w:t>
+              <w:t>0.41</w:t>
             </w:r>
           </w:p>
         </w:tc>
@@ -18322,10 +19629,10 @@
               <w:rPr>
                 <w:rFonts w:ascii="Times New Roman" w:hAnsi="Times New Roman"/>
                 <w:b/>
-                <w:color w:val="C80000"/>
-                <w:sz w:val="17"/>
-              </w:rPr>
-              <w:t>VƯỢT TẢI</w:t>
+                <w:color w:val="008000"/>
+                <w:sz w:val="17"/>
+              </w:rPr>
+              <w:t>ĐẠT</w:t>
             </w:r>
           </w:p>
         </w:tc>
@@ -18473,7 +19780,7 @@
                 <w:rFonts w:ascii="Times New Roman" w:hAnsi="Times New Roman"/>
                 <w:sz w:val="17"/>
               </w:rPr>
-              <w:t>4500.0</w:t>
+              <w:t>10927.1</w:t>
             </w:r>
           </w:p>
         </w:tc>
@@ -18497,7 +19804,7 @@
                 <w:rFonts w:ascii="Times New Roman" w:hAnsi="Times New Roman"/>
                 <w:sz w:val="17"/>
               </w:rPr>
-              <w:t>0.96</w:t>
+              <w:t>0.40</w:t>
             </w:r>
           </w:p>
         </w:tc>
@@ -18671,7 +19978,7 @@
                 <w:rFonts w:ascii="Times New Roman" w:hAnsi="Times New Roman"/>
                 <w:sz w:val="17"/>
               </w:rPr>
-              <w:t>4500.0</w:t>
+              <w:t>10927.1</w:t>
             </w:r>
           </w:p>
         </w:tc>
@@ -18695,7 +20002,7 @@
                 <w:rFonts w:ascii="Times New Roman" w:hAnsi="Times New Roman"/>
                 <w:sz w:val="17"/>
               </w:rPr>
-              <w:t>0.97</w:t>
+              <w:t>0.40</w:t>
             </w:r>
           </w:p>
         </w:tc>
@@ -18869,7 +20176,7 @@
                 <w:rFonts w:ascii="Times New Roman" w:hAnsi="Times New Roman"/>
                 <w:sz w:val="17"/>
               </w:rPr>
-              <w:t>4500.0</w:t>
+              <w:t>10927.1</w:t>
             </w:r>
           </w:p>
         </w:tc>
@@ -18893,7 +20200,7 @@
                 <w:rFonts w:ascii="Times New Roman" w:hAnsi="Times New Roman"/>
                 <w:sz w:val="17"/>
               </w:rPr>
-              <w:t>0.98</w:t>
+              <w:t>0.40</w:t>
             </w:r>
           </w:p>
         </w:tc>
@@ -19067,7 +20374,7 @@
                 <w:rFonts w:ascii="Times New Roman" w:hAnsi="Times New Roman"/>
                 <w:sz w:val="17"/>
               </w:rPr>
-              <w:t>4500.0</w:t>
+              <w:t>10927.1</w:t>
             </w:r>
           </w:p>
         </w:tc>
@@ -19091,7 +20398,7 @@
                 <w:rFonts w:ascii="Times New Roman" w:hAnsi="Times New Roman"/>
                 <w:sz w:val="17"/>
               </w:rPr>
-              <w:t>0.98</w:t>
+              <w:t>0.40</w:t>
             </w:r>
           </w:p>
         </w:tc>
@@ -19265,7 +20572,7 @@
                 <w:rFonts w:ascii="Times New Roman" w:hAnsi="Times New Roman"/>
                 <w:sz w:val="17"/>
               </w:rPr>
-              <w:t>4500.0</w:t>
+              <w:t>10927.1</w:t>
             </w:r>
           </w:p>
         </w:tc>
@@ -19289,7 +20596,7 @@
                 <w:rFonts w:ascii="Times New Roman" w:hAnsi="Times New Roman"/>
                 <w:sz w:val="17"/>
               </w:rPr>
-              <w:t>0.99</w:t>
+              <w:t>0.41</w:t>
             </w:r>
           </w:p>
         </w:tc>
@@ -19463,7 +20770,7 @@
                 <w:rFonts w:ascii="Times New Roman" w:hAnsi="Times New Roman"/>
                 <w:sz w:val="17"/>
               </w:rPr>
-              <w:t>4500.0</w:t>
+              <w:t>10927.1</w:t>
             </w:r>
           </w:p>
         </w:tc>
@@ -19487,7 +20794,7 @@
                 <w:rFonts w:ascii="Times New Roman" w:hAnsi="Times New Roman"/>
                 <w:sz w:val="17"/>
               </w:rPr>
-              <w:t>1.00</w:t>
+              <w:t>0.41</w:t>
             </w:r>
           </w:p>
         </w:tc>
@@ -19510,10 +20817,10 @@
               <w:rPr>
                 <w:rFonts w:ascii="Times New Roman" w:hAnsi="Times New Roman"/>
                 <w:b/>
-                <w:color w:val="C80000"/>
-                <w:sz w:val="17"/>
-              </w:rPr>
-              <w:t>VƯỢT TẢI</w:t>
+                <w:color w:val="008000"/>
+                <w:sz w:val="17"/>
+              </w:rPr>
+              <w:t>ĐẠT</w:t>
             </w:r>
           </w:p>
         </w:tc>
@@ -19661,7 +20968,7 @@
                 <w:rFonts w:ascii="Times New Roman" w:hAnsi="Times New Roman"/>
                 <w:sz w:val="17"/>
               </w:rPr>
-              <w:t>8100.0</w:t>
+              <w:t>10927.1</w:t>
             </w:r>
           </w:p>
         </w:tc>
@@ -19685,7 +20992,7 @@
                 <w:rFonts w:ascii="Times New Roman" w:hAnsi="Times New Roman"/>
                 <w:sz w:val="17"/>
               </w:rPr>
-              <w:t>0.85</w:t>
+              <w:t>0.63</w:t>
             </w:r>
           </w:p>
         </w:tc>
@@ -19859,7 +21166,7 @@
                 <w:rFonts w:ascii="Times New Roman" w:hAnsi="Times New Roman"/>
                 <w:sz w:val="17"/>
               </w:rPr>
-              <w:t>8100.0</w:t>
+              <w:t>10927.1</w:t>
             </w:r>
           </w:p>
         </w:tc>
@@ -19883,7 +21190,7 @@
                 <w:rFonts w:ascii="Times New Roman" w:hAnsi="Times New Roman"/>
                 <w:sz w:val="17"/>
               </w:rPr>
-              <w:t>0.68</w:t>
+              <w:t>0.50</w:t>
             </w:r>
           </w:p>
         </w:tc>
@@ -19950,7 +21257,7 @@
         <w:rPr>
           <w:color w:val="1F4E79"/>
         </w:rPr>
-        <w:t>CHƯƠNG 6. CHI TIẾT KIỂM TOÁN CÁC BỘ PHẬN KẾT CẤU</w:t>
+        <w:t>CHƯƠNG 7. CHI TIẾT KIỂM TOÁN CÁC BỘ PHẬN KẾT CẤU</w:t>
       </w:r>
     </w:p>
     <w:p>
@@ -20039,9 +21346,9 @@
       <w:r>
         <w:rPr>
           <w:b/>
-          <w:color w:val="C80000"/>
+          <w:color w:val="008000"/>
         </w:rPr>
-        <w:t>KẾT LUẬN: Một số chỉ tiêu kiểm toán chưa thỏa mãn điều kiện theo TCVN 11823:2017. Đề nghị kỹ sư điều chỉnh kích thước hoặc tăng cường cốt thép.</w:t>
+        <w:t>KẾT LUẬN: Kết cấu Mố cầu đáp ứng đầy đủ tất cả các điều kiện cường độ, sử dụng, nứt và ổn định móng cọc theo tiêu chuẩn TCVN 11823:2017. Đủ điều kiện triển khai bản vẽ thi công.</w:t>
       </w:r>
     </w:p>
     <w:sectPr>

</xml_diff>

<commit_message>
Fix abutment wing wall 6-point geometry matching the detail view exact coordinates
</commit_message>
<xml_diff>
--- a/output_reports/Mố A1_Bao_cao.docx
+++ b/output_reports/Mố A1_Bao_cao.docx
@@ -1300,7 +1300,7 @@
                 <w:rFonts w:ascii="Times New Roman" w:hAnsi="Times New Roman"/>
                 <w:sz w:val="17"/>
               </w:rPr>
-              <w:t>Mu = 11544.9 kNm</w:t>
+              <w:t>Mu = 28752.6 kNm</w:t>
             </w:r>
           </w:p>
         </w:tc>
@@ -1348,7 +1348,7 @@
                 <w:rFonts w:ascii="Times New Roman" w:hAnsi="Times New Roman"/>
                 <w:sz w:val="17"/>
               </w:rPr>
-              <w:t>0.16</w:t>
+              <w:t>0.40</w:t>
             </w:r>
           </w:p>
         </w:tc>
@@ -1448,7 +1448,7 @@
                 <w:rFonts w:ascii="Times New Roman" w:hAnsi="Times New Roman"/>
                 <w:sz w:val="17"/>
               </w:rPr>
-              <w:t>Mu = 51898.3 kNm</w:t>
+              <w:t>Mu = 73049.8 kNm</w:t>
             </w:r>
           </w:p>
         </w:tc>
@@ -1496,7 +1496,7 @@
                 <w:rFonts w:ascii="Times New Roman" w:hAnsi="Times New Roman"/>
                 <w:sz w:val="17"/>
               </w:rPr>
-              <w:t>0.72</w:t>
+              <w:t>1.01</w:t>
             </w:r>
           </w:p>
         </w:tc>
@@ -1543,10 +1543,10 @@
               <w:rPr>
                 <w:rFonts w:ascii="Times New Roman" w:hAnsi="Times New Roman"/>
                 <w:b/>
-                <w:color w:val="008000"/>
-                <w:sz w:val="17"/>
-              </w:rPr>
-              <w:t>ĐẠT</w:t>
+                <w:color w:val="C80000"/>
+                <w:sz w:val="17"/>
+              </w:rPr>
+              <w:t>KHÔNG ĐẠT</w:t>
             </w:r>
           </w:p>
         </w:tc>
@@ -1596,7 +1596,7 @@
                 <w:rFonts w:ascii="Times New Roman" w:hAnsi="Times New Roman"/>
                 <w:sz w:val="17"/>
               </w:rPr>
-              <w:t>Vu = 6283.0 kN</w:t>
+              <w:t>Vu = 6216.2 kN</w:t>
             </w:r>
           </w:p>
         </w:tc>
@@ -1744,7 +1744,7 @@
                 <w:rFonts w:ascii="Times New Roman" w:hAnsi="Times New Roman"/>
                 <w:sz w:val="17"/>
               </w:rPr>
-              <w:t>Pmax = 6283.0 kN</w:t>
+              <w:t>Pmax = 6216.2 kN</w:t>
             </w:r>
           </w:p>
         </w:tc>
@@ -1792,7 +1792,7 @@
                 <w:rFonts w:ascii="Times New Roman" w:hAnsi="Times New Roman"/>
                 <w:sz w:val="17"/>
               </w:rPr>
-              <w:t>0.94</w:t>
+              <w:t>0.93</w:t>
             </w:r>
           </w:p>
         </w:tc>
@@ -2040,7 +2040,7 @@
                 <w:rFonts w:ascii="Times New Roman" w:hAnsi="Times New Roman"/>
                 <w:sz w:val="17"/>
               </w:rPr>
-              <w:t>Pmin = 1470.6 kN</w:t>
+              <w:t>Pmin = 1591.7 kN</w:t>
             </w:r>
           </w:p>
         </w:tc>
@@ -2762,7 +2762,7 @@
                 <w:rFonts w:ascii="Times New Roman" w:hAnsi="Times New Roman"/>
                 <w:sz w:val="17"/>
               </w:rPr>
-              <w:t>Góc chéo α = 70.0°</w:t>
+              <w:t>Góc chéo α = 70°</w:t>
             </w:r>
           </w:p>
         </w:tc>
@@ -12529,7 +12529,7 @@
       <w:r>
         <w:t>• Đường kính cọc D = 1.2 m | Chiều dài cọc L = 35.00 m</w:t>
         <w:br/>
-        <w:t>• Cao độ đáy bệ = 0.0 m | Cao độ mũi cọc = -35.0 m | Mực nước ngầm = 2.0 m</w:t>
+        <w:t>• Cao độ đáy bệ = 0 m | Cao độ mũi cọc = -35 m | Mực nước ngầm = 2 m</w:t>
         <w:br/>
         <w:t>• Sức kháng ma sát thân danh định: Qsn = 9883.6 kN</w:t>
         <w:br/>
@@ -13990,7 +13990,7 @@
                 <w:rFonts w:ascii="Times New Roman" w:hAnsi="Times New Roman"/>
                 <w:sz w:val="17"/>
               </w:rPr>
-              <w:t>6058.1</w:t>
+              <w:t>5839.4</w:t>
             </w:r>
           </w:p>
         </w:tc>
@@ -14014,7 +14014,7 @@
                 <w:rFonts w:ascii="Times New Roman" w:hAnsi="Times New Roman"/>
                 <w:sz w:val="17"/>
               </w:rPr>
-              <w:t>1740.6</w:t>
+              <w:t>1922.9</w:t>
             </w:r>
           </w:p>
         </w:tc>
@@ -14062,7 +14062,7 @@
                 <w:rFonts w:ascii="Times New Roman" w:hAnsi="Times New Roman"/>
                 <w:sz w:val="17"/>
               </w:rPr>
-              <w:t>0.90</w:t>
+              <w:t>0.87</w:t>
             </w:r>
           </w:p>
         </w:tc>
@@ -14188,7 +14188,7 @@
                 <w:rFonts w:ascii="Times New Roman" w:hAnsi="Times New Roman"/>
                 <w:sz w:val="17"/>
               </w:rPr>
-              <w:t>6224.0</w:t>
+              <w:t>5932.6</w:t>
             </w:r>
           </w:p>
         </w:tc>
@@ -14212,7 +14212,7 @@
                 <w:rFonts w:ascii="Times New Roman" w:hAnsi="Times New Roman"/>
                 <w:sz w:val="17"/>
               </w:rPr>
-              <w:t>1725.6</w:t>
+              <w:t>1968.4</w:t>
             </w:r>
           </w:p>
         </w:tc>
@@ -14260,7 +14260,7 @@
                 <w:rFonts w:ascii="Times New Roman" w:hAnsi="Times New Roman"/>
                 <w:sz w:val="17"/>
               </w:rPr>
-              <w:t>0.93</w:t>
+              <w:t>0.88</w:t>
             </w:r>
           </w:p>
         </w:tc>
@@ -14386,7 +14386,7 @@
                 <w:rFonts w:ascii="Times New Roman" w:hAnsi="Times New Roman"/>
                 <w:sz w:val="17"/>
               </w:rPr>
-              <w:t>6283.0</w:t>
+              <w:t>6004.6</w:t>
             </w:r>
           </w:p>
         </w:tc>
@@ -14410,7 +14410,7 @@
                 <w:rFonts w:ascii="Times New Roman" w:hAnsi="Times New Roman"/>
                 <w:sz w:val="17"/>
               </w:rPr>
-              <w:t>1770.4</w:t>
+              <w:t>2002.4</w:t>
             </w:r>
           </w:p>
         </w:tc>
@@ -14458,7 +14458,7 @@
                 <w:rFonts w:ascii="Times New Roman" w:hAnsi="Times New Roman"/>
                 <w:sz w:val="17"/>
               </w:rPr>
-              <w:t>0.94</w:t>
+              <w:t>0.89</w:t>
             </w:r>
           </w:p>
         </w:tc>
@@ -14584,7 +14584,7 @@
                 <w:rFonts w:ascii="Times New Roman" w:hAnsi="Times New Roman"/>
                 <w:sz w:val="17"/>
               </w:rPr>
-              <w:t>6211.1</w:t>
+              <w:t>6022.3</w:t>
             </w:r>
           </w:p>
         </w:tc>
@@ -14608,7 +14608,7 @@
                 <w:rFonts w:ascii="Times New Roman" w:hAnsi="Times New Roman"/>
                 <w:sz w:val="17"/>
               </w:rPr>
-              <w:t>1851.9</w:t>
+              <w:t>2009.2</w:t>
             </w:r>
           </w:p>
         </w:tc>
@@ -14656,7 +14656,7 @@
                 <w:rFonts w:ascii="Times New Roman" w:hAnsi="Times New Roman"/>
                 <w:sz w:val="17"/>
               </w:rPr>
-              <w:t>0.93</w:t>
+              <w:t>0.90</w:t>
             </w:r>
           </w:p>
         </w:tc>
@@ -14782,7 +14782,7 @@
                 <w:rFonts w:ascii="Times New Roman" w:hAnsi="Times New Roman"/>
                 <w:sz w:val="17"/>
               </w:rPr>
-              <w:t>6231.7</w:t>
+              <w:t>6114.5</w:t>
             </w:r>
           </w:p>
         </w:tc>
@@ -14806,7 +14806,7 @@
                 <w:rFonts w:ascii="Times New Roman" w:hAnsi="Times New Roman"/>
                 <w:sz w:val="17"/>
               </w:rPr>
-              <w:t>1954.0</w:t>
+              <w:t>2051.6</w:t>
             </w:r>
           </w:p>
         </w:tc>
@@ -14854,7 +14854,7 @@
                 <w:rFonts w:ascii="Times New Roman" w:hAnsi="Times New Roman"/>
                 <w:sz w:val="17"/>
               </w:rPr>
-              <w:t>0.93</w:t>
+              <w:t>0.91</w:t>
             </w:r>
           </w:p>
         </w:tc>
@@ -14980,7 +14980,7 @@
                 <w:rFonts w:ascii="Times New Roman" w:hAnsi="Times New Roman"/>
                 <w:sz w:val="17"/>
               </w:rPr>
-              <w:t>6214.2</w:t>
+              <w:t>6216.2</w:t>
             </w:r>
           </w:p>
         </w:tc>
@@ -15004,7 +15004,7 @@
                 <w:rFonts w:ascii="Times New Roman" w:hAnsi="Times New Roman"/>
                 <w:sz w:val="17"/>
               </w:rPr>
-              <w:t>2094.3</w:t>
+              <w:t>2092.7</w:t>
             </w:r>
           </w:p>
         </w:tc>
@@ -15376,7 +15376,7 @@
                 <w:rFonts w:ascii="Times New Roman" w:hAnsi="Times New Roman"/>
                 <w:sz w:val="17"/>
               </w:rPr>
-              <w:t>5969.3</w:t>
+              <w:t>5969.4</w:t>
             </w:r>
           </w:p>
         </w:tc>
@@ -15574,7 +15574,7 @@
                 <w:rFonts w:ascii="Times New Roman" w:hAnsi="Times New Roman"/>
                 <w:sz w:val="17"/>
               </w:rPr>
-              <w:t>6039.7</w:t>
+              <w:t>6039.8</w:t>
             </w:r>
           </w:p>
         </w:tc>
@@ -15796,7 +15796,7 @@
                 <w:rFonts w:ascii="Times New Roman" w:hAnsi="Times New Roman"/>
                 <w:sz w:val="17"/>
               </w:rPr>
-              <w:t>2017.1</w:t>
+              <w:t>2017.0</w:t>
             </w:r>
           </w:p>
         </w:tc>
@@ -15994,7 +15994,7 @@
                 <w:rFonts w:ascii="Times New Roman" w:hAnsi="Times New Roman"/>
                 <w:sz w:val="17"/>
               </w:rPr>
-              <w:t>2056.6</w:t>
+              <w:t>2056.5</w:t>
             </w:r>
           </w:p>
         </w:tc>
@@ -16168,7 +16168,7 @@
                 <w:rFonts w:ascii="Times New Roman" w:hAnsi="Times New Roman"/>
                 <w:sz w:val="17"/>
               </w:rPr>
-              <w:t>6212.4</w:t>
+              <w:t>6212.5</w:t>
             </w:r>
           </w:p>
         </w:tc>
@@ -16192,7 +16192,7 @@
                 <w:rFonts w:ascii="Times New Roman" w:hAnsi="Times New Roman"/>
                 <w:sz w:val="17"/>
               </w:rPr>
-              <w:t>2096.1</w:t>
+              <w:t>2096.0</w:t>
             </w:r>
           </w:p>
         </w:tc>
@@ -16366,7 +16366,7 @@
                 <w:rFonts w:ascii="Times New Roman" w:hAnsi="Times New Roman"/>
                 <w:sz w:val="17"/>
               </w:rPr>
-              <w:t>5276.4</w:t>
+              <w:t>5057.7</w:t>
             </w:r>
           </w:p>
         </w:tc>
@@ -16390,7 +16390,7 @@
                 <w:rFonts w:ascii="Times New Roman" w:hAnsi="Times New Roman"/>
                 <w:sz w:val="17"/>
               </w:rPr>
-              <w:t>599.1</w:t>
+              <w:t>781.4</w:t>
             </w:r>
           </w:p>
         </w:tc>
@@ -16438,7 +16438,7 @@
                 <w:rFonts w:ascii="Times New Roman" w:hAnsi="Times New Roman"/>
                 <w:sz w:val="17"/>
               </w:rPr>
-              <w:t>0.79</w:t>
+              <w:t>0.75</w:t>
             </w:r>
           </w:p>
         </w:tc>
@@ -16564,7 +16564,7 @@
                 <w:rFonts w:ascii="Times New Roman" w:hAnsi="Times New Roman"/>
                 <w:sz w:val="17"/>
               </w:rPr>
-              <w:t>5442.3</w:t>
+              <w:t>5150.9</w:t>
             </w:r>
           </w:p>
         </w:tc>
@@ -16588,7 +16588,7 @@
                 <w:rFonts w:ascii="Times New Roman" w:hAnsi="Times New Roman"/>
                 <w:sz w:val="17"/>
               </w:rPr>
-              <w:t>584.1</w:t>
+              <w:t>826.9</w:t>
             </w:r>
           </w:p>
         </w:tc>
@@ -16636,7 +16636,7 @@
                 <w:rFonts w:ascii="Times New Roman" w:hAnsi="Times New Roman"/>
                 <w:sz w:val="17"/>
               </w:rPr>
-              <w:t>0.81</w:t>
+              <w:t>0.77</w:t>
             </w:r>
           </w:p>
         </w:tc>
@@ -16762,7 +16762,7 @@
                 <w:rFonts w:ascii="Times New Roman" w:hAnsi="Times New Roman"/>
                 <w:sz w:val="17"/>
               </w:rPr>
-              <w:t>5501.3</w:t>
+              <w:t>5222.9</w:t>
             </w:r>
           </w:p>
         </w:tc>
@@ -16786,7 +16786,7 @@
                 <w:rFonts w:ascii="Times New Roman" w:hAnsi="Times New Roman"/>
                 <w:sz w:val="17"/>
               </w:rPr>
-              <w:t>629.0</w:t>
+              <w:t>860.9</w:t>
             </w:r>
           </w:p>
         </w:tc>
@@ -16834,7 +16834,7 @@
                 <w:rFonts w:ascii="Times New Roman" w:hAnsi="Times New Roman"/>
                 <w:sz w:val="17"/>
               </w:rPr>
-              <w:t>0.82</w:t>
+              <w:t>0.78</w:t>
             </w:r>
           </w:p>
         </w:tc>
@@ -16960,7 +16960,7 @@
                 <w:rFonts w:ascii="Times New Roman" w:hAnsi="Times New Roman"/>
                 <w:sz w:val="17"/>
               </w:rPr>
-              <w:t>5429.4</w:t>
+              <w:t>5240.6</w:t>
             </w:r>
           </w:p>
         </w:tc>
@@ -16984,7 +16984,7 @@
                 <w:rFonts w:ascii="Times New Roman" w:hAnsi="Times New Roman"/>
                 <w:sz w:val="17"/>
               </w:rPr>
-              <w:t>710.4</w:t>
+              <w:t>867.7</w:t>
             </w:r>
           </w:p>
         </w:tc>
@@ -17032,7 +17032,7 @@
                 <w:rFonts w:ascii="Times New Roman" w:hAnsi="Times New Roman"/>
                 <w:sz w:val="17"/>
               </w:rPr>
-              <w:t>0.81</w:t>
+              <w:t>0.78</w:t>
             </w:r>
           </w:p>
         </w:tc>
@@ -17158,7 +17158,7 @@
                 <w:rFonts w:ascii="Times New Roman" w:hAnsi="Times New Roman"/>
                 <w:sz w:val="17"/>
               </w:rPr>
-              <w:t>5449.9</w:t>
+              <w:t>5332.8</w:t>
             </w:r>
           </w:p>
         </w:tc>
@@ -17182,7 +17182,7 @@
                 <w:rFonts w:ascii="Times New Roman" w:hAnsi="Times New Roman"/>
                 <w:sz w:val="17"/>
               </w:rPr>
-              <w:t>812.6</w:t>
+              <w:t>910.2</w:t>
             </w:r>
           </w:p>
         </w:tc>
@@ -17230,7 +17230,7 @@
                 <w:rFonts w:ascii="Times New Roman" w:hAnsi="Times New Roman"/>
                 <w:sz w:val="17"/>
               </w:rPr>
-              <w:t>0.81</w:t>
+              <w:t>0.79</w:t>
             </w:r>
           </w:p>
         </w:tc>
@@ -17356,7 +17356,7 @@
                 <w:rFonts w:ascii="Times New Roman" w:hAnsi="Times New Roman"/>
                 <w:sz w:val="17"/>
               </w:rPr>
-              <w:t>5432.5</w:t>
+              <w:t>5434.5</w:t>
             </w:r>
           </w:p>
         </w:tc>
@@ -17380,7 +17380,7 @@
                 <w:rFonts w:ascii="Times New Roman" w:hAnsi="Times New Roman"/>
                 <w:sz w:val="17"/>
               </w:rPr>
-              <w:t>952.8</w:t>
+              <w:t>951.2</w:t>
             </w:r>
           </w:p>
         </w:tc>
@@ -17554,7 +17554,7 @@
                 <w:rFonts w:ascii="Times New Roman" w:hAnsi="Times New Roman"/>
                 <w:sz w:val="17"/>
               </w:rPr>
-              <w:t>5333.6</w:t>
+              <w:t>5269.7</w:t>
             </w:r>
           </w:p>
         </w:tc>
@@ -17578,7 +17578,7 @@
                 <w:rFonts w:ascii="Times New Roman" w:hAnsi="Times New Roman"/>
                 <w:sz w:val="17"/>
               </w:rPr>
-              <w:t>1938.4</w:t>
+              <w:t>1991.6</w:t>
             </w:r>
           </w:p>
         </w:tc>
@@ -17752,7 +17752,7 @@
                 <w:rFonts w:ascii="Times New Roman" w:hAnsi="Times New Roman"/>
                 <w:sz w:val="17"/>
               </w:rPr>
-              <w:t>4551.9</w:t>
+              <w:t>4488.0</w:t>
             </w:r>
           </w:p>
         </w:tc>
@@ -17776,7 +17776,7 @@
                 <w:rFonts w:ascii="Times New Roman" w:hAnsi="Times New Roman"/>
                 <w:sz w:val="17"/>
               </w:rPr>
-              <w:t>796.9</w:t>
+              <w:t>850.1</w:t>
             </w:r>
           </w:p>
         </w:tc>
@@ -17824,7 +17824,7 @@
                 <w:rFonts w:ascii="Times New Roman" w:hAnsi="Times New Roman"/>
                 <w:sz w:val="17"/>
               </w:rPr>
-              <w:t>0.68</w:t>
+              <w:t>0.67</w:t>
             </w:r>
           </w:p>
         </w:tc>
@@ -18148,7 +18148,7 @@
                 <w:rFonts w:ascii="Times New Roman" w:hAnsi="Times New Roman"/>
                 <w:sz w:val="17"/>
               </w:rPr>
-              <w:t>5893.7</w:t>
+              <w:t>5713.9</w:t>
             </w:r>
           </w:p>
         </w:tc>
@@ -18172,7 +18172,7 @@
                 <w:rFonts w:ascii="Times New Roman" w:hAnsi="Times New Roman"/>
                 <w:sz w:val="17"/>
               </w:rPr>
-              <w:t>1785.3</w:t>
+              <w:t>1935.2</w:t>
             </w:r>
           </w:p>
         </w:tc>
@@ -18220,7 +18220,7 @@
                 <w:rFonts w:ascii="Times New Roman" w:hAnsi="Times New Roman"/>
                 <w:sz w:val="17"/>
               </w:rPr>
-              <w:t>0.88</w:t>
+              <w:t>0.85</w:t>
             </w:r>
           </w:p>
         </w:tc>
@@ -18346,7 +18346,7 @@
                 <w:rFonts w:ascii="Times New Roman" w:hAnsi="Times New Roman"/>
                 <w:sz w:val="17"/>
               </w:rPr>
-              <w:t>6011.4</w:t>
+              <w:t>6001.8</w:t>
             </w:r>
           </w:p>
         </w:tc>
@@ -18370,7 +18370,7 @@
                 <w:rFonts w:ascii="Times New Roman" w:hAnsi="Times New Roman"/>
                 <w:sz w:val="17"/>
               </w:rPr>
-              <w:t>2060.9</w:t>
+              <w:t>2068.8</w:t>
             </w:r>
           </w:p>
         </w:tc>
@@ -18418,7 +18418,7 @@
                 <w:rFonts w:ascii="Times New Roman" w:hAnsi="Times New Roman"/>
                 <w:sz w:val="17"/>
               </w:rPr>
-              <w:t>0.90</w:t>
+              <w:t>0.89</w:t>
             </w:r>
           </w:p>
         </w:tc>
@@ -18544,7 +18544,7 @@
                 <w:rFonts w:ascii="Times New Roman" w:hAnsi="Times New Roman"/>
                 <w:sz w:val="17"/>
               </w:rPr>
-              <w:t>4446.8</w:t>
+              <w:t>4311.7</w:t>
             </w:r>
           </w:p>
         </w:tc>
@@ -18568,7 +18568,7 @@
                 <w:rFonts w:ascii="Times New Roman" w:hAnsi="Times New Roman"/>
                 <w:sz w:val="17"/>
               </w:rPr>
-              <w:t>1479.2</w:t>
+              <w:t>1591.7</w:t>
             </w:r>
           </w:p>
         </w:tc>
@@ -18616,7 +18616,7 @@
                 <w:rFonts w:ascii="Times New Roman" w:hAnsi="Times New Roman"/>
                 <w:sz w:val="17"/>
               </w:rPr>
-              <w:t>0.41</w:t>
+              <w:t>0.39</w:t>
             </w:r>
           </w:p>
         </w:tc>
@@ -18742,7 +18742,7 @@
                 <w:rFonts w:ascii="Times New Roman" w:hAnsi="Times New Roman"/>
                 <w:sz w:val="17"/>
               </w:rPr>
-              <w:t>4541.6</w:t>
+              <w:t>4365.0</w:t>
             </w:r>
           </w:p>
         </w:tc>
@@ -18766,7 +18766,7 @@
                 <w:rFonts w:ascii="Times New Roman" w:hAnsi="Times New Roman"/>
                 <w:sz w:val="17"/>
               </w:rPr>
-              <w:t>1470.6</w:t>
+              <w:t>1617.7</w:t>
             </w:r>
           </w:p>
         </w:tc>
@@ -18814,7 +18814,7 @@
                 <w:rFonts w:ascii="Times New Roman" w:hAnsi="Times New Roman"/>
                 <w:sz w:val="17"/>
               </w:rPr>
-              <w:t>0.42</w:t>
+              <w:t>0.40</w:t>
             </w:r>
           </w:p>
         </w:tc>
@@ -18940,7 +18940,7 @@
                 <w:rFonts w:ascii="Times New Roman" w:hAnsi="Times New Roman"/>
                 <w:sz w:val="17"/>
               </w:rPr>
-              <w:t>4575.3</w:t>
+              <w:t>4406.2</w:t>
             </w:r>
           </w:p>
         </w:tc>
@@ -18964,7 +18964,7 @@
                 <w:rFonts w:ascii="Times New Roman" w:hAnsi="Times New Roman"/>
                 <w:sz w:val="17"/>
               </w:rPr>
-              <w:t>1496.2</w:t>
+              <w:t>1637.1</w:t>
             </w:r>
           </w:p>
         </w:tc>
@@ -19012,7 +19012,7 @@
                 <w:rFonts w:ascii="Times New Roman" w:hAnsi="Times New Roman"/>
                 <w:sz w:val="17"/>
               </w:rPr>
-              <w:t>0.42</w:t>
+              <w:t>0.40</w:t>
             </w:r>
           </w:p>
         </w:tc>
@@ -19138,7 +19138,7 @@
                 <w:rFonts w:ascii="Times New Roman" w:hAnsi="Times New Roman"/>
                 <w:sz w:val="17"/>
               </w:rPr>
-              <w:t>4534.2</w:t>
+              <w:t>4416.3</w:t>
             </w:r>
           </w:p>
         </w:tc>
@@ -19162,7 +19162,7 @@
                 <w:rFonts w:ascii="Times New Roman" w:hAnsi="Times New Roman"/>
                 <w:sz w:val="17"/>
               </w:rPr>
-              <w:t>1542.8</w:t>
+              <w:t>1641.0</w:t>
             </w:r>
           </w:p>
         </w:tc>
@@ -19210,7 +19210,7 @@
                 <w:rFonts w:ascii="Times New Roman" w:hAnsi="Times New Roman"/>
                 <w:sz w:val="17"/>
               </w:rPr>
-              <w:t>0.41</w:t>
+              <w:t>0.40</w:t>
             </w:r>
           </w:p>
         </w:tc>
@@ -19336,7 +19336,7 @@
                 <w:rFonts w:ascii="Times New Roman" w:hAnsi="Times New Roman"/>
                 <w:sz w:val="17"/>
               </w:rPr>
-              <w:t>4546.0</w:t>
+              <w:t>4468.9</w:t>
             </w:r>
           </w:p>
         </w:tc>
@@ -19360,7 +19360,7 @@
                 <w:rFonts w:ascii="Times New Roman" w:hAnsi="Times New Roman"/>
                 <w:sz w:val="17"/>
               </w:rPr>
-              <w:t>1601.1</w:t>
+              <w:t>1665.3</w:t>
             </w:r>
           </w:p>
         </w:tc>
@@ -19408,7 +19408,7 @@
                 <w:rFonts w:ascii="Times New Roman" w:hAnsi="Times New Roman"/>
                 <w:sz w:val="17"/>
               </w:rPr>
-              <w:t>0.42</w:t>
+              <w:t>0.41</w:t>
             </w:r>
           </w:p>
         </w:tc>
@@ -19534,7 +19534,7 @@
                 <w:rFonts w:ascii="Times New Roman" w:hAnsi="Times New Roman"/>
                 <w:sz w:val="17"/>
               </w:rPr>
-              <w:t>4534.0</w:t>
+              <w:t>4525.0</w:t>
             </w:r>
           </w:p>
         </w:tc>
@@ -19558,7 +19558,7 @@
                 <w:rFonts w:ascii="Times New Roman" w:hAnsi="Times New Roman"/>
                 <w:sz w:val="17"/>
               </w:rPr>
-              <w:t>1683.3</w:t>
+              <w:t>1690.7</w:t>
             </w:r>
           </w:p>
         </w:tc>
@@ -19732,7 +19732,7 @@
                 <w:rFonts w:ascii="Times New Roman" w:hAnsi="Times New Roman"/>
                 <w:sz w:val="17"/>
               </w:rPr>
-              <w:t>4319.3</w:t>
+              <w:t>4319.4</w:t>
             </w:r>
           </w:p>
         </w:tc>
@@ -19930,7 +19930,7 @@
                 <w:rFonts w:ascii="Times New Roman" w:hAnsi="Times New Roman"/>
                 <w:sz w:val="17"/>
               </w:rPr>
-              <w:t>4377.8</w:t>
+              <w:t>4377.9</w:t>
             </w:r>
           </w:p>
         </w:tc>
@@ -20128,7 +20128,7 @@
                 <w:rFonts w:ascii="Times New Roman" w:hAnsi="Times New Roman"/>
                 <w:sz w:val="17"/>
               </w:rPr>
-              <w:t>4418.0</w:t>
+              <w:t>4418.1</w:t>
             </w:r>
           </w:p>
         </w:tc>
@@ -20524,7 +20524,7 @@
                 <w:rFonts w:ascii="Times New Roman" w:hAnsi="Times New Roman"/>
                 <w:sz w:val="17"/>
               </w:rPr>
-              <w:t>4469.2</w:t>
+              <w:t>4469.3</w:t>
             </w:r>
           </w:p>
         </w:tc>
@@ -20722,7 +20722,7 @@
                 <w:rFonts w:ascii="Times New Roman" w:hAnsi="Times New Roman"/>
                 <w:sz w:val="17"/>
               </w:rPr>
-              <w:t>4516.7</w:t>
+              <w:t>4516.8</w:t>
             </w:r>
           </w:p>
         </w:tc>
@@ -20746,7 +20746,7 @@
                 <w:rFonts w:ascii="Times New Roman" w:hAnsi="Times New Roman"/>
                 <w:sz w:val="17"/>
               </w:rPr>
-              <w:t>1699.0</w:t>
+              <w:t>1698.9</w:t>
             </w:r>
           </w:p>
         </w:tc>
@@ -21118,7 +21118,7 @@
                 <w:rFonts w:ascii="Times New Roman" w:hAnsi="Times New Roman"/>
                 <w:sz w:val="17"/>
               </w:rPr>
-              <w:t>5486.3</w:t>
+              <w:t>4939.6</w:t>
             </w:r>
           </w:p>
         </w:tc>
@@ -21142,7 +21142,7 @@
                 <w:rFonts w:ascii="Times New Roman" w:hAnsi="Times New Roman"/>
                 <w:sz w:val="17"/>
               </w:rPr>
-              <w:t>1926.7</w:t>
+              <w:t>2382.3</w:t>
             </w:r>
           </w:p>
         </w:tc>
@@ -21190,7 +21190,7 @@
                 <w:rFonts w:ascii="Times New Roman" w:hAnsi="Times New Roman"/>
                 <w:sz w:val="17"/>
               </w:rPr>
-              <w:t>0.50</w:t>
+              <w:t>0.45</w:t>
             </w:r>
           </w:p>
         </w:tc>
@@ -21323,11 +21323,11 @@
       <w:r>
         <w:t>• Bề rộng B1 = 6.00 m, C1 = 23.55 m, H1 = 1.80 m, Thép đáy dọc cầu Φ28 @ 120mm</w:t>
         <w:br/>
-        <w:t>• Uốn mũi bệ (Toe): Mu = 11544.9 kNm &lt;= Mr = 72204.1 kNm ➔ ĐẠT</w:t>
+        <w:t>• Uốn mũi bệ (Toe): Mu = 28752.6 kNm &lt;= Mr = 72204.1 kNm ➔ ĐẠT</w:t>
         <w:br/>
-        <w:t>• Uốn gót bệ (Heel): Mu = 51898.3 kNm &lt;= Mr = 72204.1 kNm ➔ ĐẠT</w:t>
+        <w:t>• Uốn gót bệ (Heel): Mu = 73049.8 kNm &lt;= Mr = 72204.1 kNm ➔ KHÔNG ĐẠT</w:t>
         <w:br/>
-        <w:t>• Đâm thủng đài bệ: Vu = 6283.0 kN &lt;= Vr = 10095.0 kN ➔ ĐẠT</w:t>
+        <w:t>• Đâm thủng đài bệ: Vu = 6216.2 kN &lt;= Vr = 10095.0 kN ➔ ĐẠT</w:t>
         <w:br/>
       </w:r>
     </w:p>
@@ -21346,9 +21346,9 @@
       <w:r>
         <w:rPr>
           <w:b/>
-          <w:color w:val="008000"/>
+          <w:color w:val="C80000"/>
         </w:rPr>
-        <w:t>KẾT LUẬN: Kết cấu Mố cầu đáp ứng đầy đủ tất cả các điều kiện cường độ, sử dụng, nứt và ổn định móng cọc theo tiêu chuẩn TCVN 11823:2017. Đủ điều kiện triển khai bản vẽ thi công.</w:t>
+        <w:t>KẾT LUẬN: Một số chỉ tiêu kiểm toán chưa thỏa mãn điều kiện theo TCVN 11823:2017. Đề nghị kỹ sư điều chỉnh kích thước hoặc tăng cường cốt thép.</w:t>
       </w:r>
     </w:p>
     <w:sectPr>

</xml_diff>

<commit_message>
Fix footing rebar layers and spacing UI, fix orthogonal pile coordinate conversion sign
</commit_message>
<xml_diff>
--- a/output_reports/Mố A1_Bao_cao.docx
+++ b/output_reports/Mố A1_Bao_cao.docx
@@ -288,7 +288,7 @@
                 <w:rFonts w:ascii="Times New Roman" w:hAnsi="Times New Roman"/>
                 <w:sz w:val="17"/>
               </w:rPr>
-              <w:t>Mr = 35601.7 kNm</w:t>
+              <w:t>Mr = 22961.6 kNm</w:t>
             </w:r>
           </w:p>
         </w:tc>
@@ -312,7 +312,7 @@
                 <w:rFonts w:ascii="Times New Roman" w:hAnsi="Times New Roman"/>
                 <w:sz w:val="17"/>
               </w:rPr>
-              <w:t>0.81</w:t>
+              <w:t>1.25</w:t>
             </w:r>
           </w:p>
         </w:tc>
@@ -359,10 +359,10 @@
               <w:rPr>
                 <w:rFonts w:ascii="Times New Roman" w:hAnsi="Times New Roman"/>
                 <w:b/>
-                <w:color w:val="008000"/>
-                <w:sz w:val="17"/>
-              </w:rPr>
-              <w:t>ĐẠT</w:t>
+                <w:color w:val="C80000"/>
+                <w:sz w:val="17"/>
+              </w:rPr>
+              <w:t>KHÔNG ĐẠT</w:t>
             </w:r>
           </w:p>
         </w:tc>
@@ -436,7 +436,7 @@
                 <w:rFonts w:ascii="Times New Roman" w:hAnsi="Times New Roman"/>
                 <w:sz w:val="17"/>
               </w:rPr>
-              <w:t>Vr = 25921.8 kN</w:t>
+              <w:t>Vr = 26122.6 kN</w:t>
             </w:r>
           </w:p>
         </w:tc>
@@ -560,7 +560,7 @@
                 <w:rFonts w:ascii="Times New Roman" w:hAnsi="Times New Roman"/>
                 <w:sz w:val="17"/>
               </w:rPr>
-              <w:t>fss = 216.5 MPa</w:t>
+              <w:t>fss = 334.5 MPa</w:t>
             </w:r>
           </w:p>
         </w:tc>
@@ -608,7 +608,7 @@
                 <w:rFonts w:ascii="Times New Roman" w:hAnsi="Times New Roman"/>
                 <w:sz w:val="17"/>
               </w:rPr>
-              <w:t>0.90</w:t>
+              <w:t>1.39</w:t>
             </w:r>
           </w:p>
         </w:tc>
@@ -655,10 +655,10 @@
               <w:rPr>
                 <w:rFonts w:ascii="Times New Roman" w:hAnsi="Times New Roman"/>
                 <w:b/>
-                <w:color w:val="008000"/>
-                <w:sz w:val="17"/>
-              </w:rPr>
-              <w:t>ĐẠT</w:t>
+                <w:color w:val="C80000"/>
+                <w:sz w:val="17"/>
+              </w:rPr>
+              <w:t>KHÔNG ĐẠT</w:t>
             </w:r>
           </w:p>
         </w:tc>
@@ -1028,7 +1028,7 @@
                 <w:rFonts w:ascii="Times New Roman" w:hAnsi="Times New Roman"/>
                 <w:sz w:val="17"/>
               </w:rPr>
-              <w:t>Mr = 308.1 kNm/m</w:t>
+              <w:t>Mr = 200.0 kNm/m</w:t>
             </w:r>
           </w:p>
         </w:tc>
@@ -1052,7 +1052,7 @@
                 <w:rFonts w:ascii="Times New Roman" w:hAnsi="Times New Roman"/>
                 <w:sz w:val="17"/>
               </w:rPr>
-              <w:t>0.77</w:t>
+              <w:t>1.18</w:t>
             </w:r>
           </w:p>
         </w:tc>
@@ -1099,10 +1099,10 @@
               <w:rPr>
                 <w:rFonts w:ascii="Times New Roman" w:hAnsi="Times New Roman"/>
                 <w:b/>
-                <w:color w:val="008000"/>
-                <w:sz w:val="17"/>
-              </w:rPr>
-              <w:t>ĐẠT</w:t>
+                <w:color w:val="C80000"/>
+                <w:sz w:val="17"/>
+              </w:rPr>
+              <w:t>KHÔNG ĐẠT</w:t>
             </w:r>
           </w:p>
         </w:tc>
@@ -1176,7 +1176,7 @@
                 <w:rFonts w:ascii="Times New Roman" w:hAnsi="Times New Roman"/>
                 <w:sz w:val="17"/>
               </w:rPr>
-              <w:t>Mr = 578.6 kNm/m</w:t>
+              <w:t>Mr = 381.2 kNm/m</w:t>
             </w:r>
           </w:p>
         </w:tc>
@@ -1200,7 +1200,7 @@
                 <w:rFonts w:ascii="Times New Roman" w:hAnsi="Times New Roman"/>
                 <w:sz w:val="17"/>
               </w:rPr>
-              <w:t>0.77</w:t>
+              <w:t>1.17</w:t>
             </w:r>
           </w:p>
         </w:tc>
@@ -1247,10 +1247,10 @@
               <w:rPr>
                 <w:rFonts w:ascii="Times New Roman" w:hAnsi="Times New Roman"/>
                 <w:b/>
-                <w:color w:val="008000"/>
-                <w:sz w:val="17"/>
-              </w:rPr>
-              <w:t>ĐẠT</w:t>
+                <w:color w:val="C80000"/>
+                <w:sz w:val="17"/>
+              </w:rPr>
+              <w:t>KHÔNG ĐẠT</w:t>
             </w:r>
           </w:p>
         </w:tc>
@@ -21271,17 +21271,17 @@
       <w:r>
         <w:t>• Tiết diện: Chiều rộng b = 25.06 m, Chiều dày h = 1.30 m, d = 1.225 m</w:t>
         <w:br/>
-        <w:t>• Cốt thép kéo mặt sau: Φ25 @ 150 mm | Thép nén mặt trước: Φ20 @ 150 mm</w:t>
+        <w:t>• Cốt thép kéo mặt sau: Φ20 @ 150 mm | Thép nén mặt trước: Φ20 @ 150 mm</w:t>
         <w:br/>
-        <w:t>• Kiểm toán Uốn ULS: Chiều sâu a = 51.6 mm, c = 61.8 mm, φ = 0.90</w:t>
+        <w:t>• Kiểm toán Uốn ULS: Chiều sâu a = 33.0 mm, c = 39.5 mm, φ = 0.90</w:t>
         <w:br/>
-        <w:t xml:space="preserve">  Sức kháng uốn: Mr = 35601.7 kNm &gt;= Mu = 28763.5 kNm (D/C = 0.81) ➔ ĐẠT</w:t>
+        <w:t xml:space="preserve">  Sức kháng uốn: Mr = 22961.6 kNm &gt;= Mu = 28763.5 kNm (D/C = 1.25) ➔ KHÔNG ĐẠT</w:t>
         <w:br/>
-        <w:t>• Kiểm toán Cắt MCFT: dv = 1199.2 mm, Vc = 27325.1 kN, Vs = 1476.8 kN</w:t>
+        <w:t>• Kiểm toán Cắt MCFT: dv = 1208.5 mm, Vc = 27536.8 kN, Vs = 1488.3 kN</w:t>
         <w:br/>
-        <w:t xml:space="preserve">  Sức kháng cắt: Vr = 25921.8 kN &gt;= Vu = 8513.4 kN (D/C = 0.33) ➔ ĐẠT</w:t>
+        <w:t xml:space="preserve">  Sức kháng cắt: Vr = 26122.6 kN &gt;= Vu = 8513.4 kN (D/C = 0.33) ➔ ĐẠT</w:t>
         <w:br/>
-        <w:t>• Kiểm soát nứt SLS: fss = 216.5 MPa &lt;= [fsa] = 240.0 MPa và s = 150mm &lt;= s_max = 300mm ➔ ĐẠT</w:t>
+        <w:t>• Kiểm soát nứt SLS: fss = 334.5 MPa &lt;= [fsa] = 240.0 MPa và s = 150mm &lt;= s_max = 188mm ➔ KHÔNG ĐẠT</w:t>
         <w:br/>
         <w:br/>
       </w:r>
@@ -21295,21 +21295,21 @@
       <w:r>
         <w:t>• Chiều cao Htc = 8.53 m, Chiều dài w1 = 5.50 m, w3 = 2.70 m, Chiều dày C3 = 0.50 m</w:t>
         <w:br/>
-        <w:t>• Ngàm đứng vào thân (thép ngang Φ20 @ 150mm):</w:t>
+        <w:t>• Ngàm đứng vào thân (thép ngang Φ16 @ 150mm):</w:t>
         <w:br/>
-        <w:t xml:space="preserve">  - Uốn: Mu = 235.8 kNm/m &lt;= Mr = 308.1 kNm/m ➔ ĐẠT</w:t>
+        <w:t xml:space="preserve">  - Uốn: Mu = 235.8 kNm/m &lt;= Mr = 200.0 kNm/m ➔ KHÔNG ĐẠT</w:t>
         <w:br/>
-        <w:t xml:space="preserve">  - Cắt: Vu = 114.7 kN/m &lt;= Vr = 500.7 kN/m ➔ ĐẠT</w:t>
+        <w:t xml:space="preserve">  - Cắt: Vu = 114.7 kN/m &lt;= Vr = 507.9 kN/m ➔ ĐẠT</w:t>
         <w:br/>
-        <w:t xml:space="preserve">  - Nứt: fss = 184.5 MPa &lt;= fsa = 240.0 MPa và s &lt;= s_max=300mm ➔ ĐẠT</w:t>
+        <w:t xml:space="preserve">  - Nứt: fss = 284.0 MPa &lt;= fsa = 240.0 MPa và s &lt;= s_max=196mm ➔ KHÔNG ĐẠT</w:t>
         <w:br/>
-        <w:t>• Ngàm đáy vào bệ (thép đứng Φ25 @ 120mm):</w:t>
+        <w:t>• Ngàm đáy vào bệ (thép đứng Φ20 @ 120mm):</w:t>
         <w:br/>
-        <w:t xml:space="preserve">  - Uốn: Mu = 444.2 kNm/m &lt;= Mr = 578.6 kNm/m ➔ ĐẠT</w:t>
+        <w:t xml:space="preserve">  - Uốn: Mu = 444.2 kNm/m &lt;= Mr = 381.2 kNm/m ➔ KHÔNG ĐẠT</w:t>
         <w:br/>
-        <w:t xml:space="preserve">  - Cắt: Vu = 230.2 kN/m &lt;= Vr = 481.5 kN/m ➔ ĐẠT</w:t>
+        <w:t xml:space="preserve">  - Cắt: Vu = 230.2 kN/m &lt;= Vr = 495.7 kN/m ➔ ĐẠT</w:t>
         <w:br/>
-        <w:t xml:space="preserve">  - Nứt: fss = 185.4 MPa &lt;= fsa = 240.0 MPa và s &lt;= s_max=300mm ➔ ĐẠT</w:t>
+        <w:t xml:space="preserve">  - Nứt: fss = 284.2 MPa &lt;= fsa = 240.0 MPa và s &lt;= s_max=196mm ➔ KHÔNG ĐẠT</w:t>
         <w:br/>
         <w:br/>
       </w:r>
@@ -21321,7 +21321,7 @@
         <w:br/>
       </w:r>
       <w:r>
-        <w:t>• Bề rộng B1 = 6.00 m, C1 = 23.55 m, H1 = 1.80 m, Thép đáy dọc cầu Φ28 @ 120mm</w:t>
+        <w:t>• Bề rộng B1 = 6.00 m, C1 = 23.55 m, H1 = 1.80 m, Thép đáy dọc cầu Φ25 @ 150mm</w:t>
         <w:br/>
         <w:t>• Uốn mũi bệ (Toe): Mu = 28752.6 kNm &lt;= Mr = 72204.1 kNm ➔ ĐẠT</w:t>
         <w:br/>

</xml_diff>